<commit_message>
Consulta 5 y 6
</commit_message>
<xml_diff>
--- a/ConsultasFarmaciaMongoDB-GrupoL.docx
+++ b/ConsultasFarmaciaMongoDB-GrupoL.docx
@@ -1,6 +1,6 @@
 
 <file path=word/document.xml><?xml version="1.0" encoding="utf-8"?>
-<w:document xmlns:wpc="http://schemas.microsoft.com/office/word/2010/wordprocessingCanvas" xmlns:mc="http://schemas.openxmlformats.org/markup-compatibility/2006" xmlns:o="urn:schemas-microsoft-com:office:office" xmlns:r="http://schemas.openxmlformats.org/officeDocument/2006/relationships" xmlns:m="http://schemas.openxmlformats.org/officeDocument/2006/math" xmlns:v="urn:schemas-microsoft-com:vml" xmlns:wp14="http://schemas.microsoft.com/office/word/2010/wordprocessingDrawing" xmlns:wp="http://schemas.openxmlformats.org/drawingml/2006/wordprocessingDrawing" xmlns:w10="urn:schemas-microsoft-com:office:word" xmlns:w="http://schemas.openxmlformats.org/wordprocessingml/2006/main" xmlns:w14="http://schemas.microsoft.com/office/word/2010/wordml" xmlns:wpg="http://schemas.microsoft.com/office/word/2010/wordprocessingGroup" xmlns:wpi="http://schemas.microsoft.com/office/word/2010/wordprocessingInk" xmlns:wne="http://schemas.microsoft.com/office/word/2006/wordml" xmlns:wps="http://schemas.microsoft.com/office/word/2010/wordprocessingShape" mc:Ignorable="w14 wp14">
+<w:document xmlns:wpc="http://schemas.microsoft.com/office/word/2010/wordprocessingCanvas" xmlns:cx="http://schemas.microsoft.com/office/drawing/2014/chartex" xmlns:cx1="http://schemas.microsoft.com/office/drawing/2015/9/8/chartex" xmlns:cx2="http://schemas.microsoft.com/office/drawing/2015/10/21/chartex" xmlns:cx3="http://schemas.microsoft.com/office/drawing/2016/5/9/chartex" xmlns:cx4="http://schemas.microsoft.com/office/drawing/2016/5/10/chartex" xmlns:cx5="http://schemas.microsoft.com/office/drawing/2016/5/11/chartex" xmlns:cx6="http://schemas.microsoft.com/office/drawing/2016/5/12/chartex" xmlns:cx7="http://schemas.microsoft.com/office/drawing/2016/5/13/chartex" xmlns:cx8="http://schemas.microsoft.com/office/drawing/2016/5/14/chartex" xmlns:mc="http://schemas.openxmlformats.org/markup-compatibility/2006" xmlns:aink="http://schemas.microsoft.com/office/drawing/2016/ink" xmlns:am3d="http://schemas.microsoft.com/office/drawing/2017/model3d" xmlns:o="urn:schemas-microsoft-com:office:office" xmlns:oel="http://schemas.microsoft.com/office/2019/extlst" xmlns:r="http://schemas.openxmlformats.org/officeDocument/2006/relationships" xmlns:m="http://schemas.openxmlformats.org/officeDocument/2006/math" xmlns:v="urn:schemas-microsoft-com:vml" xmlns:wp14="http://schemas.microsoft.com/office/word/2010/wordprocessingDrawing" xmlns:wp="http://schemas.openxmlformats.org/drawingml/2006/wordprocessingDrawing" xmlns:w10="urn:schemas-microsoft-com:office:word" xmlns:w="http://schemas.openxmlformats.org/wordprocessingml/2006/main" xmlns:w14="http://schemas.microsoft.com/office/word/2010/wordml" xmlns:w15="http://schemas.microsoft.com/office/word/2012/wordml" xmlns:w16cex="http://schemas.microsoft.com/office/word/2018/wordml/cex" xmlns:w16cid="http://schemas.microsoft.com/office/word/2016/wordml/cid" xmlns:w16="http://schemas.microsoft.com/office/word/2018/wordml" xmlns:w16du="http://schemas.microsoft.com/office/word/2023/wordml/word16du" xmlns:w16sdtdh="http://schemas.microsoft.com/office/word/2020/wordml/sdtdatahash" xmlns:w16sdtfl="http://schemas.microsoft.com/office/word/2024/wordml/sdtformatlock" xmlns:w16se="http://schemas.microsoft.com/office/word/2015/wordml/symex" xmlns:wpg="http://schemas.microsoft.com/office/word/2010/wordprocessingGroup" xmlns:wpi="http://schemas.microsoft.com/office/word/2010/wordprocessingInk" xmlns:wne="http://schemas.microsoft.com/office/word/2006/wordml" xmlns:wps="http://schemas.microsoft.com/office/word/2010/wordprocessingShape" mc:Ignorable="w14 w15 w16se w16cid w16 w16cex w16sdtdh w16sdtfl w16du wp14">
   <w:body>
     <w:p>
       <w:pPr>
@@ -85,20 +85,48 @@
         <w:rPr>
           <w:lang w:val="es-MX"/>
         </w:rPr>
-        <w:t xml:space="preserve">        $gte: "2026-05-01",</w:t>
-      </w:r>
-    </w:p>
-    <w:p>
-      <w:pPr>
-        <w:rPr>
-          <w:lang w:val="es-MX"/>
-        </w:rPr>
-      </w:pPr>
-      <w:r>
-        <w:rPr>
-          <w:lang w:val="es-MX"/>
-        </w:rPr>
-        <w:t xml:space="preserve">        $lte: "2026-05-10"</w:t>
+        <w:t xml:space="preserve">        $</w:t>
+      </w:r>
+      <w:proofErr w:type="spellStart"/>
+      <w:r>
+        <w:rPr>
+          <w:lang w:val="es-MX"/>
+        </w:rPr>
+        <w:t>gte</w:t>
+      </w:r>
+      <w:proofErr w:type="spellEnd"/>
+      <w:r>
+        <w:rPr>
+          <w:lang w:val="es-MX"/>
+        </w:rPr>
+        <w:t>: "2026-05-01",</w:t>
+      </w:r>
+    </w:p>
+    <w:p>
+      <w:pPr>
+        <w:rPr>
+          <w:lang w:val="es-MX"/>
+        </w:rPr>
+      </w:pPr>
+      <w:r>
+        <w:rPr>
+          <w:lang w:val="es-MX"/>
+        </w:rPr>
+        <w:t xml:space="preserve">        $</w:t>
+      </w:r>
+      <w:proofErr w:type="spellStart"/>
+      <w:r>
+        <w:rPr>
+          <w:lang w:val="es-MX"/>
+        </w:rPr>
+        <w:t>lte</w:t>
+      </w:r>
+      <w:proofErr w:type="spellEnd"/>
+      <w:r>
+        <w:rPr>
+          <w:lang w:val="es-MX"/>
+        </w:rPr>
+        <w:t>: "2026-05-10"</w:t>
       </w:r>
     </w:p>
     <w:p>
@@ -163,20 +191,48 @@
         <w:rPr>
           <w:lang w:val="es-MX"/>
         </w:rPr>
-        <w:t xml:space="preserve">    $facet: {</w:t>
-      </w:r>
-    </w:p>
-    <w:p>
-      <w:pPr>
-        <w:rPr>
-          <w:lang w:val="es-MX"/>
-        </w:rPr>
-      </w:pPr>
-      <w:r>
-        <w:rPr>
-          <w:lang w:val="es-MX"/>
-        </w:rPr>
-        <w:t xml:space="preserve">      totalCadena: [</w:t>
+        <w:t xml:space="preserve">    $</w:t>
+      </w:r>
+      <w:proofErr w:type="spellStart"/>
+      <w:r>
+        <w:rPr>
+          <w:lang w:val="es-MX"/>
+        </w:rPr>
+        <w:t>facet</w:t>
+      </w:r>
+      <w:proofErr w:type="spellEnd"/>
+      <w:r>
+        <w:rPr>
+          <w:lang w:val="es-MX"/>
+        </w:rPr>
+        <w:t>: {</w:t>
+      </w:r>
+    </w:p>
+    <w:p>
+      <w:pPr>
+        <w:rPr>
+          <w:lang w:val="es-MX"/>
+        </w:rPr>
+      </w:pPr>
+      <w:r>
+        <w:rPr>
+          <w:lang w:val="es-MX"/>
+        </w:rPr>
+        <w:t xml:space="preserve">      </w:t>
+      </w:r>
+      <w:proofErr w:type="spellStart"/>
+      <w:r>
+        <w:rPr>
+          <w:lang w:val="es-MX"/>
+        </w:rPr>
+        <w:t>totalCadena</w:t>
+      </w:r>
+      <w:proofErr w:type="spellEnd"/>
+      <w:r>
+        <w:rPr>
+          <w:lang w:val="es-MX"/>
+        </w:rPr>
+        <w:t>: [</w:t>
       </w:r>
     </w:p>
     <w:p>
@@ -202,7 +258,35 @@
         <w:rPr>
           <w:lang w:val="es-MX"/>
         </w:rPr>
-        <w:t xml:space="preserve">          $count: "totalVentas"</w:t>
+        <w:t xml:space="preserve">          $</w:t>
+      </w:r>
+      <w:proofErr w:type="spellStart"/>
+      <w:r>
+        <w:rPr>
+          <w:lang w:val="es-MX"/>
+        </w:rPr>
+        <w:t>count</w:t>
+      </w:r>
+      <w:proofErr w:type="spellEnd"/>
+      <w:r>
+        <w:rPr>
+          <w:lang w:val="es-MX"/>
+        </w:rPr>
+        <w:t>: "</w:t>
+      </w:r>
+      <w:proofErr w:type="spellStart"/>
+      <w:r>
+        <w:rPr>
+          <w:lang w:val="es-MX"/>
+        </w:rPr>
+        <w:t>totalVentas</w:t>
+      </w:r>
+      <w:proofErr w:type="spellEnd"/>
+      <w:r>
+        <w:rPr>
+          <w:lang w:val="es-MX"/>
+        </w:rPr>
+        <w:t>"</w:t>
       </w:r>
     </w:p>
     <w:p>
@@ -241,7 +325,21 @@
         <w:rPr>
           <w:lang w:val="es-MX"/>
         </w:rPr>
-        <w:t xml:space="preserve">      porSucursal: [</w:t>
+        <w:t xml:space="preserve">      </w:t>
+      </w:r>
+      <w:proofErr w:type="spellStart"/>
+      <w:r>
+        <w:rPr>
+          <w:lang w:val="es-MX"/>
+        </w:rPr>
+        <w:t>porSucursal</w:t>
+      </w:r>
+      <w:proofErr w:type="spellEnd"/>
+      <w:r>
+        <w:rPr>
+          <w:lang w:val="es-MX"/>
+        </w:rPr>
+        <w:t>: [</w:t>
       </w:r>
     </w:p>
     <w:p>
@@ -267,33 +365,77 @@
         <w:rPr>
           <w:lang w:val="es-MX"/>
         </w:rPr>
-        <w:t xml:space="preserve">          $group: {</w:t>
-      </w:r>
-    </w:p>
-    <w:p>
-      <w:pPr>
-        <w:rPr>
-          <w:lang w:val="es-MX"/>
-        </w:rPr>
-      </w:pPr>
-      <w:r>
-        <w:rPr>
-          <w:lang w:val="es-MX"/>
-        </w:rPr>
-        <w:t xml:space="preserve">            _id: "$sucursal.puntoVenta",</w:t>
-      </w:r>
-    </w:p>
-    <w:p>
-      <w:pPr>
-        <w:rPr>
-          <w:lang w:val="es-MX"/>
-        </w:rPr>
-      </w:pPr>
-      <w:r>
-        <w:rPr>
-          <w:lang w:val="es-MX"/>
-        </w:rPr>
-        <w:t xml:space="preserve">            cantidadVentas: {</w:t>
+        <w:t xml:space="preserve">          $</w:t>
+      </w:r>
+      <w:proofErr w:type="spellStart"/>
+      <w:r>
+        <w:rPr>
+          <w:lang w:val="es-MX"/>
+        </w:rPr>
+        <w:t>group</w:t>
+      </w:r>
+      <w:proofErr w:type="spellEnd"/>
+      <w:r>
+        <w:rPr>
+          <w:lang w:val="es-MX"/>
+        </w:rPr>
+        <w:t>: {</w:t>
+      </w:r>
+    </w:p>
+    <w:p>
+      <w:pPr>
+        <w:rPr>
+          <w:lang w:val="es-MX"/>
+        </w:rPr>
+      </w:pPr>
+      <w:r>
+        <w:rPr>
+          <w:lang w:val="es-MX"/>
+        </w:rPr>
+        <w:t xml:space="preserve">            _id: "$</w:t>
+      </w:r>
+      <w:proofErr w:type="spellStart"/>
+      <w:proofErr w:type="gramStart"/>
+      <w:r>
+        <w:rPr>
+          <w:lang w:val="es-MX"/>
+        </w:rPr>
+        <w:t>sucursal.puntoVenta</w:t>
+      </w:r>
+      <w:proofErr w:type="spellEnd"/>
+      <w:proofErr w:type="gramEnd"/>
+      <w:r>
+        <w:rPr>
+          <w:lang w:val="es-MX"/>
+        </w:rPr>
+        <w:t>",</w:t>
+      </w:r>
+    </w:p>
+    <w:p>
+      <w:pPr>
+        <w:rPr>
+          <w:lang w:val="es-MX"/>
+        </w:rPr>
+      </w:pPr>
+      <w:r>
+        <w:rPr>
+          <w:lang w:val="es-MX"/>
+        </w:rPr>
+        <w:t xml:space="preserve">            </w:t>
+      </w:r>
+      <w:proofErr w:type="spellStart"/>
+      <w:r>
+        <w:rPr>
+          <w:lang w:val="es-MX"/>
+        </w:rPr>
+        <w:t>cantidadVentas</w:t>
+      </w:r>
+      <w:proofErr w:type="spellEnd"/>
+      <w:r>
+        <w:rPr>
+          <w:lang w:val="es-MX"/>
+        </w:rPr>
+        <w:t>: {</w:t>
       </w:r>
     </w:p>
     <w:p>
@@ -423,7 +565,6 @@
           <w:bCs/>
           <w:lang w:val="es-MX"/>
         </w:rPr>
-        <w:lastRenderedPageBreak/>
         <w:t>REULTADOS CONSULTA</w:t>
       </w:r>
       <w:r>
@@ -463,7 +604,21 @@
         <w:rPr>
           <w:lang w:val="es-MX"/>
         </w:rPr>
-        <w:t xml:space="preserve">  "totalCadena": [</w:t>
+        <w:t xml:space="preserve">  "</w:t>
+      </w:r>
+      <w:proofErr w:type="spellStart"/>
+      <w:r>
+        <w:rPr>
+          <w:lang w:val="es-MX"/>
+        </w:rPr>
+        <w:t>totalCadena</w:t>
+      </w:r>
+      <w:proofErr w:type="spellEnd"/>
+      <w:r>
+        <w:rPr>
+          <w:lang w:val="es-MX"/>
+        </w:rPr>
+        <w:t>": [</w:t>
       </w:r>
     </w:p>
     <w:p>
@@ -489,7 +644,21 @@
         <w:rPr>
           <w:lang w:val="es-MX"/>
         </w:rPr>
-        <w:t xml:space="preserve">      "totalVentas": 36</w:t>
+        <w:t xml:space="preserve">      "</w:t>
+      </w:r>
+      <w:proofErr w:type="spellStart"/>
+      <w:r>
+        <w:rPr>
+          <w:lang w:val="es-MX"/>
+        </w:rPr>
+        <w:t>totalVentas</w:t>
+      </w:r>
+      <w:proofErr w:type="spellEnd"/>
+      <w:r>
+        <w:rPr>
+          <w:lang w:val="es-MX"/>
+        </w:rPr>
+        <w:t>": 36</w:t>
       </w:r>
     </w:p>
     <w:p>
@@ -528,7 +697,21 @@
         <w:rPr>
           <w:lang w:val="es-MX"/>
         </w:rPr>
-        <w:t xml:space="preserve">  "porSucursal": [</w:t>
+        <w:t xml:space="preserve">  "</w:t>
+      </w:r>
+      <w:proofErr w:type="spellStart"/>
+      <w:r>
+        <w:rPr>
+          <w:lang w:val="es-MX"/>
+        </w:rPr>
+        <w:t>porSucursal</w:t>
+      </w:r>
+      <w:proofErr w:type="spellEnd"/>
+      <w:r>
+        <w:rPr>
+          <w:lang w:val="es-MX"/>
+        </w:rPr>
+        <w:t>": [</w:t>
       </w:r>
     </w:p>
     <w:p>
@@ -567,7 +750,21 @@
         <w:rPr>
           <w:lang w:val="es-MX"/>
         </w:rPr>
-        <w:t xml:space="preserve">      "cantidadVentas": 12</w:t>
+        <w:t xml:space="preserve">      "</w:t>
+      </w:r>
+      <w:proofErr w:type="spellStart"/>
+      <w:r>
+        <w:rPr>
+          <w:lang w:val="es-MX"/>
+        </w:rPr>
+        <w:t>cantidadVentas</w:t>
+      </w:r>
+      <w:proofErr w:type="spellEnd"/>
+      <w:r>
+        <w:rPr>
+          <w:lang w:val="es-MX"/>
+        </w:rPr>
+        <w:t>": 12</w:t>
       </w:r>
     </w:p>
     <w:p>
@@ -619,7 +816,21 @@
         <w:rPr>
           <w:lang w:val="es-MX"/>
         </w:rPr>
-        <w:t xml:space="preserve">      "cantidadVentas": 12</w:t>
+        <w:t xml:space="preserve">      "</w:t>
+      </w:r>
+      <w:proofErr w:type="spellStart"/>
+      <w:r>
+        <w:rPr>
+          <w:lang w:val="es-MX"/>
+        </w:rPr>
+        <w:t>cantidadVentas</w:t>
+      </w:r>
+      <w:proofErr w:type="spellEnd"/>
+      <w:r>
+        <w:rPr>
+          <w:lang w:val="es-MX"/>
+        </w:rPr>
+        <w:t>": 12</w:t>
       </w:r>
     </w:p>
     <w:p>
@@ -671,7 +882,21 @@
         <w:rPr>
           <w:lang w:val="es-MX"/>
         </w:rPr>
-        <w:t xml:space="preserve">      "cantidadVentas": 12</w:t>
+        <w:t xml:space="preserve">      "</w:t>
+      </w:r>
+      <w:proofErr w:type="spellStart"/>
+      <w:r>
+        <w:rPr>
+          <w:lang w:val="es-MX"/>
+        </w:rPr>
+        <w:t>cantidadVentas</w:t>
+      </w:r>
+      <w:proofErr w:type="spellEnd"/>
+      <w:r>
+        <w:rPr>
+          <w:lang w:val="es-MX"/>
+        </w:rPr>
+        <w:t>": 12</w:t>
       </w:r>
     </w:p>
     <w:p>
@@ -743,7 +968,7 @@
                     </pic:cNvPicPr>
                   </pic:nvPicPr>
                   <pic:blipFill rotWithShape="1">
-                    <a:blip r:embed="rId5" cstate="print">
+                    <a:blip r:embed="rId4" cstate="print">
                       <a:extLst>
                         <a:ext uri="{28A0092B-C50C-407E-A947-70E740481C1C}">
                           <a14:useLocalDpi xmlns:a14="http://schemas.microsoft.com/office/drawing/2010/main" val="0"/>
@@ -790,7 +1015,6 @@
           <w:bCs/>
           <w:lang w:val="es-MX"/>
         </w:rPr>
-        <w:lastRenderedPageBreak/>
         <w:t>CONSULTA 4</w:t>
       </w:r>
       <w:r>
@@ -862,44 +1086,78 @@
         <w:rPr>
           <w:lang w:val="es-MX"/>
         </w:rPr>
-        <w:t xml:space="preserve">        $gte: "2026-05-01",</w:t>
-      </w:r>
-    </w:p>
-    <w:p>
-      <w:pPr>
-        <w:rPr>
-          <w:lang w:val="es-MX"/>
-        </w:rPr>
-      </w:pPr>
-      <w:r>
-        <w:rPr>
-          <w:lang w:val="es-MX"/>
-        </w:rPr>
-        <w:t xml:space="preserve">        $lte: "2026-05-10"</w:t>
-      </w:r>
-    </w:p>
-    <w:p>
-      <w:pPr>
-        <w:rPr>
-          <w:lang w:val="es-MX"/>
-        </w:rPr>
-      </w:pPr>
-      <w:r>
-        <w:rPr>
-          <w:lang w:val="es-MX"/>
-        </w:rPr>
-        <w:t xml:space="preserve">      }</w:t>
-      </w:r>
-    </w:p>
-    <w:p>
-      <w:pPr>
-        <w:rPr>
-          <w:lang w:val="es-MX"/>
-        </w:rPr>
-      </w:pPr>
-      <w:r>
-        <w:rPr>
-          <w:lang w:val="es-MX"/>
+        <w:t xml:space="preserve">        $</w:t>
+      </w:r>
+      <w:proofErr w:type="spellStart"/>
+      <w:r>
+        <w:rPr>
+          <w:lang w:val="es-MX"/>
+        </w:rPr>
+        <w:t>gte</w:t>
+      </w:r>
+      <w:proofErr w:type="spellEnd"/>
+      <w:r>
+        <w:rPr>
+          <w:lang w:val="es-MX"/>
+        </w:rPr>
+        <w:t>: "2026-05-01",</w:t>
+      </w:r>
+    </w:p>
+    <w:p>
+      <w:pPr>
+        <w:rPr>
+          <w:lang w:val="es-MX"/>
+        </w:rPr>
+      </w:pPr>
+      <w:r>
+        <w:rPr>
+          <w:lang w:val="es-MX"/>
+        </w:rPr>
+        <w:t xml:space="preserve">        $</w:t>
+      </w:r>
+      <w:proofErr w:type="spellStart"/>
+      <w:r>
+        <w:rPr>
+          <w:lang w:val="es-MX"/>
+        </w:rPr>
+        <w:t>lte</w:t>
+      </w:r>
+      <w:proofErr w:type="spellEnd"/>
+      <w:r>
+        <w:rPr>
+          <w:lang w:val="es-MX"/>
+        </w:rPr>
+        <w:t>: "2026-05-10"</w:t>
+      </w:r>
+    </w:p>
+    <w:p>
+      <w:pPr>
+        <w:rPr>
+          <w:lang w:val="en-US"/>
+        </w:rPr>
+      </w:pPr>
+      <w:r>
+        <w:rPr>
+          <w:lang w:val="es-MX"/>
+        </w:rPr>
+        <w:t xml:space="preserve">      </w:t>
+      </w:r>
+      <w:r>
+        <w:rPr>
+          <w:lang w:val="en-US"/>
+        </w:rPr>
+        <w:t>}</w:t>
+      </w:r>
+    </w:p>
+    <w:p>
+      <w:pPr>
+        <w:rPr>
+          <w:lang w:val="en-US"/>
+        </w:rPr>
+      </w:pPr>
+      <w:r>
+        <w:rPr>
+          <w:lang w:val="en-US"/>
         </w:rPr>
         <w:t xml:space="preserve">    }</w:t>
       </w:r>
@@ -907,12 +1165,12 @@
     <w:p>
       <w:pPr>
         <w:rPr>
-          <w:lang w:val="es-MX"/>
-        </w:rPr>
-      </w:pPr>
-      <w:r>
-        <w:rPr>
-          <w:lang w:val="es-MX"/>
+          <w:lang w:val="en-US"/>
+        </w:rPr>
+      </w:pPr>
+      <w:r>
+        <w:rPr>
+          <w:lang w:val="en-US"/>
         </w:rPr>
         <w:t xml:space="preserve">  },</w:t>
       </w:r>
@@ -920,12 +1178,12 @@
     <w:p>
       <w:pPr>
         <w:rPr>
-          <w:lang w:val="es-MX"/>
-        </w:rPr>
-      </w:pPr>
-      <w:r>
-        <w:rPr>
-          <w:lang w:val="es-MX"/>
+          <w:lang w:val="en-US"/>
+        </w:rPr>
+      </w:pPr>
+      <w:r>
+        <w:rPr>
+          <w:lang w:val="en-US"/>
         </w:rPr>
         <w:t xml:space="preserve">  {</w:t>
       </w:r>
@@ -933,12 +1191,12 @@
     <w:p>
       <w:pPr>
         <w:rPr>
-          <w:lang w:val="es-MX"/>
-        </w:rPr>
-      </w:pPr>
-      <w:r>
-        <w:rPr>
-          <w:lang w:val="es-MX"/>
+          <w:lang w:val="en-US"/>
+        </w:rPr>
+      </w:pPr>
+      <w:r>
+        <w:rPr>
+          <w:lang w:val="en-US"/>
         </w:rPr>
         <w:t xml:space="preserve">    $unwind:</w:t>
       </w:r>
@@ -946,12 +1204,12 @@
     <w:p>
       <w:pPr>
         <w:rPr>
-          <w:lang w:val="es-MX"/>
-        </w:rPr>
-      </w:pPr>
-      <w:r>
-        <w:rPr>
-          <w:lang w:val="es-MX"/>
+          <w:lang w:val="en-US"/>
+        </w:rPr>
+      </w:pPr>
+      <w:r>
+        <w:rPr>
+          <w:lang w:val="en-US"/>
         </w:rPr>
         <w:t xml:space="preserve">      /**</w:t>
       </w:r>
@@ -959,64 +1217,120 @@
     <w:p>
       <w:pPr>
         <w:rPr>
-          <w:lang w:val="es-MX"/>
-        </w:rPr>
-      </w:pPr>
-      <w:r>
-        <w:rPr>
-          <w:lang w:val="es-MX"/>
-        </w:rPr>
-        <w:t xml:space="preserve">       * path: Path to the array field.</w:t>
-      </w:r>
-    </w:p>
-    <w:p>
-      <w:pPr>
-        <w:rPr>
-          <w:lang w:val="es-MX"/>
-        </w:rPr>
-      </w:pPr>
-      <w:r>
-        <w:rPr>
-          <w:lang w:val="es-MX"/>
-        </w:rPr>
-        <w:t xml:space="preserve">       * includeArrayIndex: Optional name for index.</w:t>
-      </w:r>
-    </w:p>
-    <w:p>
-      <w:pPr>
-        <w:rPr>
-          <w:lang w:val="es-MX"/>
-        </w:rPr>
-      </w:pPr>
-      <w:r>
-        <w:rPr>
-          <w:lang w:val="es-MX"/>
-        </w:rPr>
-        <w:t xml:space="preserve">       * preserveNullAndEmptyArrays: Optional</w:t>
-      </w:r>
-    </w:p>
-    <w:p>
-      <w:pPr>
-        <w:rPr>
-          <w:lang w:val="es-MX"/>
-        </w:rPr>
-      </w:pPr>
-      <w:r>
-        <w:rPr>
-          <w:lang w:val="es-MX"/>
-        </w:rPr>
-        <w:t xml:space="preserve">       *   toggle to unwind null and empty values.</w:t>
-      </w:r>
-    </w:p>
-    <w:p>
-      <w:pPr>
-        <w:rPr>
-          <w:lang w:val="es-MX"/>
-        </w:rPr>
-      </w:pPr>
-      <w:r>
-        <w:rPr>
-          <w:lang w:val="es-MX"/>
+          <w:lang w:val="en-US"/>
+        </w:rPr>
+      </w:pPr>
+      <w:r>
+        <w:rPr>
+          <w:lang w:val="en-US"/>
+        </w:rPr>
+        <w:t xml:space="preserve">       * </w:t>
+      </w:r>
+      <w:proofErr w:type="gramStart"/>
+      <w:r>
+        <w:rPr>
+          <w:lang w:val="en-US"/>
+        </w:rPr>
+        <w:t>path</w:t>
+      </w:r>
+      <w:proofErr w:type="gramEnd"/>
+      <w:r>
+        <w:rPr>
+          <w:lang w:val="en-US"/>
+        </w:rPr>
+        <w:t>: Path to the array field.</w:t>
+      </w:r>
+    </w:p>
+    <w:p>
+      <w:pPr>
+        <w:rPr>
+          <w:lang w:val="en-US"/>
+        </w:rPr>
+      </w:pPr>
+      <w:r>
+        <w:rPr>
+          <w:lang w:val="en-US"/>
+        </w:rPr>
+        <w:t xml:space="preserve">       * </w:t>
+      </w:r>
+      <w:proofErr w:type="spellStart"/>
+      <w:r>
+        <w:rPr>
+          <w:lang w:val="en-US"/>
+        </w:rPr>
+        <w:t>includeArrayIndex</w:t>
+      </w:r>
+      <w:proofErr w:type="spellEnd"/>
+      <w:r>
+        <w:rPr>
+          <w:lang w:val="en-US"/>
+        </w:rPr>
+        <w:t>: Optional name for index.</w:t>
+      </w:r>
+    </w:p>
+    <w:p>
+      <w:pPr>
+        <w:rPr>
+          <w:lang w:val="en-US"/>
+        </w:rPr>
+      </w:pPr>
+      <w:r>
+        <w:rPr>
+          <w:lang w:val="en-US"/>
+        </w:rPr>
+        <w:t xml:space="preserve">       * </w:t>
+      </w:r>
+      <w:proofErr w:type="spellStart"/>
+      <w:r>
+        <w:rPr>
+          <w:lang w:val="en-US"/>
+        </w:rPr>
+        <w:t>preserveNullAndEmptyArrays</w:t>
+      </w:r>
+      <w:proofErr w:type="spellEnd"/>
+      <w:r>
+        <w:rPr>
+          <w:lang w:val="en-US"/>
+        </w:rPr>
+        <w:t>: Optional</w:t>
+      </w:r>
+    </w:p>
+    <w:p>
+      <w:pPr>
+        <w:rPr>
+          <w:lang w:val="en-US"/>
+        </w:rPr>
+      </w:pPr>
+      <w:r>
+        <w:rPr>
+          <w:lang w:val="en-US"/>
+        </w:rPr>
+        <w:t xml:space="preserve">       *   </w:t>
+      </w:r>
+      <w:proofErr w:type="gramStart"/>
+      <w:r>
+        <w:rPr>
+          <w:lang w:val="en-US"/>
+        </w:rPr>
+        <w:t>toggle</w:t>
+      </w:r>
+      <w:proofErr w:type="gramEnd"/>
+      <w:r>
+        <w:rPr>
+          <w:lang w:val="en-US"/>
+        </w:rPr>
+        <w:t xml:space="preserve"> to unwind null and empty values.</w:t>
+      </w:r>
+    </w:p>
+    <w:p>
+      <w:pPr>
+        <w:rPr>
+          <w:lang w:val="en-US"/>
+        </w:rPr>
+      </w:pPr>
+      <w:r>
+        <w:rPr>
+          <w:lang w:val="en-US"/>
         </w:rPr>
         <w:t xml:space="preserve">       */</w:t>
       </w:r>
@@ -1024,19 +1338,19 @@
     <w:p>
       <w:pPr>
         <w:rPr>
-          <w:lang w:val="es-MX"/>
-        </w:rPr>
-      </w:pPr>
-    </w:p>
-    <w:p>
-      <w:pPr>
-        <w:rPr>
-          <w:lang w:val="es-MX"/>
-        </w:rPr>
-      </w:pPr>
-      <w:r>
-        <w:rPr>
-          <w:lang w:val="es-MX"/>
+          <w:lang w:val="en-US"/>
+        </w:rPr>
+      </w:pPr>
+    </w:p>
+    <w:p>
+      <w:pPr>
+        <w:rPr>
+          <w:lang w:val="en-US"/>
+        </w:rPr>
+      </w:pPr>
+      <w:r>
+        <w:rPr>
+          <w:lang w:val="en-US"/>
         </w:rPr>
         <w:t xml:space="preserve">      "$items"</w:t>
       </w:r>
@@ -1044,12 +1358,12 @@
     <w:p>
       <w:pPr>
         <w:rPr>
-          <w:lang w:val="es-MX"/>
-        </w:rPr>
-      </w:pPr>
-      <w:r>
-        <w:rPr>
-          <w:lang w:val="es-MX"/>
+          <w:lang w:val="en-US"/>
+        </w:rPr>
+      </w:pPr>
+      <w:r>
+        <w:rPr>
+          <w:lang w:val="en-US"/>
         </w:rPr>
         <w:t xml:space="preserve">  },</w:t>
       </w:r>
@@ -1057,12 +1371,12 @@
     <w:p>
       <w:pPr>
         <w:rPr>
-          <w:lang w:val="es-MX"/>
-        </w:rPr>
-      </w:pPr>
-      <w:r>
-        <w:rPr>
-          <w:lang w:val="es-MX"/>
+          <w:lang w:val="en-US"/>
+        </w:rPr>
+      </w:pPr>
+      <w:r>
+        <w:rPr>
+          <w:lang w:val="en-US"/>
         </w:rPr>
         <w:t xml:space="preserve">  {</w:t>
       </w:r>
@@ -1070,12 +1384,12 @@
     <w:p>
       <w:pPr>
         <w:rPr>
-          <w:lang w:val="es-MX"/>
-        </w:rPr>
-      </w:pPr>
-      <w:r>
-        <w:rPr>
-          <w:lang w:val="es-MX"/>
+          <w:lang w:val="en-US"/>
+        </w:rPr>
+      </w:pPr>
+      <w:r>
+        <w:rPr>
+          <w:lang w:val="en-US"/>
         </w:rPr>
         <w:t xml:space="preserve">    $group:</w:t>
       </w:r>
@@ -1083,12 +1397,12 @@
     <w:p>
       <w:pPr>
         <w:rPr>
-          <w:lang w:val="es-MX"/>
-        </w:rPr>
-      </w:pPr>
-      <w:r>
-        <w:rPr>
-          <w:lang w:val="es-MX"/>
+          <w:lang w:val="en-US"/>
+        </w:rPr>
+      </w:pPr>
+      <w:r>
+        <w:rPr>
+          <w:lang w:val="en-US"/>
         </w:rPr>
         <w:t xml:space="preserve">      /**</w:t>
       </w:r>
@@ -1096,12 +1410,12 @@
     <w:p>
       <w:pPr>
         <w:rPr>
-          <w:lang w:val="es-MX"/>
-        </w:rPr>
-      </w:pPr>
-      <w:r>
-        <w:rPr>
-          <w:lang w:val="es-MX"/>
+          <w:lang w:val="en-US"/>
+        </w:rPr>
+      </w:pPr>
+      <w:r>
+        <w:rPr>
+          <w:lang w:val="en-US"/>
         </w:rPr>
         <w:t xml:space="preserve">       * _id: The id of the group.</w:t>
       </w:r>
@@ -1109,27 +1423,47 @@
     <w:p>
       <w:pPr>
         <w:rPr>
-          <w:lang w:val="es-MX"/>
-        </w:rPr>
-      </w:pPr>
-      <w:r>
-        <w:rPr>
-          <w:lang w:val="es-MX"/>
-        </w:rPr>
-        <w:t xml:space="preserve">       * fieldN: The first field name.</w:t>
-      </w:r>
-    </w:p>
-    <w:p>
-      <w:pPr>
-        <w:rPr>
-          <w:lang w:val="es-MX"/>
-        </w:rPr>
-      </w:pPr>
-      <w:r>
-        <w:rPr>
-          <w:lang w:val="es-MX"/>
-        </w:rPr>
-        <w:t xml:space="preserve">       */</w:t>
+          <w:lang w:val="en-US"/>
+        </w:rPr>
+      </w:pPr>
+      <w:r>
+        <w:rPr>
+          <w:lang w:val="en-US"/>
+        </w:rPr>
+        <w:t xml:space="preserve">       * </w:t>
+      </w:r>
+      <w:proofErr w:type="spellStart"/>
+      <w:r>
+        <w:rPr>
+          <w:lang w:val="en-US"/>
+        </w:rPr>
+        <w:t>fieldN</w:t>
+      </w:r>
+      <w:proofErr w:type="spellEnd"/>
+      <w:r>
+        <w:rPr>
+          <w:lang w:val="en-US"/>
+        </w:rPr>
+        <w:t>: The first field name.</w:t>
+      </w:r>
+    </w:p>
+    <w:p>
+      <w:pPr>
+        <w:rPr>
+          <w:lang w:val="es-MX"/>
+        </w:rPr>
+      </w:pPr>
+      <w:r>
+        <w:rPr>
+          <w:lang w:val="en-US"/>
+        </w:rPr>
+        <w:t xml:space="preserve">       </w:t>
+      </w:r>
+      <w:r>
+        <w:rPr>
+          <w:lang w:val="es-MX"/>
+        </w:rPr>
+        <w:t>*/</w:t>
       </w:r>
     </w:p>
     <w:p>
@@ -1155,46 +1489,97 @@
         <w:rPr>
           <w:lang w:val="es-MX"/>
         </w:rPr>
-        <w:t xml:space="preserve">        _id: "$items.producto.tipo",</w:t>
-      </w:r>
-    </w:p>
-    <w:p>
-      <w:pPr>
-        <w:rPr>
-          <w:lang w:val="es-MX"/>
-        </w:rPr>
-      </w:pPr>
-      <w:r>
-        <w:rPr>
-          <w:lang w:val="es-MX"/>
-        </w:rPr>
-        <w:t xml:space="preserve">        cantidadVendida: {</w:t>
-      </w:r>
-    </w:p>
-    <w:p>
-      <w:pPr>
-        <w:rPr>
-          <w:lang w:val="es-MX"/>
-        </w:rPr>
-      </w:pPr>
-      <w:r>
-        <w:rPr>
-          <w:lang w:val="es-MX"/>
-        </w:rPr>
-        <w:t xml:space="preserve">          $sum: "$items.cantidad"</w:t>
-      </w:r>
-    </w:p>
-    <w:p>
-      <w:pPr>
-        <w:rPr>
-          <w:lang w:val="es-MX"/>
-        </w:rPr>
-      </w:pPr>
-      <w:r>
-        <w:rPr>
-          <w:lang w:val="es-MX"/>
-        </w:rPr>
-        <w:lastRenderedPageBreak/>
+        <w:t xml:space="preserve">        _id: "$</w:t>
+      </w:r>
+      <w:proofErr w:type="spellStart"/>
+      <w:proofErr w:type="gramStart"/>
+      <w:r>
+        <w:rPr>
+          <w:lang w:val="es-MX"/>
+        </w:rPr>
+        <w:t>items.producto</w:t>
+      </w:r>
+      <w:proofErr w:type="gramEnd"/>
+      <w:r>
+        <w:rPr>
+          <w:lang w:val="es-MX"/>
+        </w:rPr>
+        <w:t>.tipo</w:t>
+      </w:r>
+      <w:proofErr w:type="spellEnd"/>
+      <w:r>
+        <w:rPr>
+          <w:lang w:val="es-MX"/>
+        </w:rPr>
+        <w:t>",</w:t>
+      </w:r>
+    </w:p>
+    <w:p>
+      <w:pPr>
+        <w:rPr>
+          <w:lang w:val="es-MX"/>
+        </w:rPr>
+      </w:pPr>
+      <w:r>
+        <w:rPr>
+          <w:lang w:val="es-MX"/>
+        </w:rPr>
+        <w:t xml:space="preserve">        </w:t>
+      </w:r>
+      <w:proofErr w:type="spellStart"/>
+      <w:r>
+        <w:rPr>
+          <w:lang w:val="es-MX"/>
+        </w:rPr>
+        <w:t>cantidadVendida</w:t>
+      </w:r>
+      <w:proofErr w:type="spellEnd"/>
+      <w:r>
+        <w:rPr>
+          <w:lang w:val="es-MX"/>
+        </w:rPr>
+        <w:t>: {</w:t>
+      </w:r>
+    </w:p>
+    <w:p>
+      <w:pPr>
+        <w:rPr>
+          <w:lang w:val="es-MX"/>
+        </w:rPr>
+      </w:pPr>
+      <w:r>
+        <w:rPr>
+          <w:lang w:val="es-MX"/>
+        </w:rPr>
+        <w:t xml:space="preserve">          $sum: "$</w:t>
+      </w:r>
+      <w:proofErr w:type="spellStart"/>
+      <w:proofErr w:type="gramStart"/>
+      <w:r>
+        <w:rPr>
+          <w:lang w:val="es-MX"/>
+        </w:rPr>
+        <w:t>items.cantidad</w:t>
+      </w:r>
+      <w:proofErr w:type="spellEnd"/>
+      <w:proofErr w:type="gramEnd"/>
+      <w:r>
+        <w:rPr>
+          <w:lang w:val="es-MX"/>
+        </w:rPr>
+        <w:t>"</w:t>
+      </w:r>
+    </w:p>
+    <w:p>
+      <w:pPr>
+        <w:rPr>
+          <w:lang w:val="es-MX"/>
+        </w:rPr>
+      </w:pPr>
+      <w:r>
+        <w:rPr>
+          <w:lang w:val="es-MX"/>
+        </w:rPr>
         <w:t xml:space="preserve">        }</w:t>
       </w:r>
     </w:p>
@@ -1256,11 +1641,43 @@
         </w:rPr>
         <w:br/>
       </w:r>
-      <w:r>
-        <w:rPr>
-          <w:lang w:val="es-MX"/>
-        </w:rPr>
-        <w:t>db.getCollection('ventas').aggregate(</w:t>
+      <w:proofErr w:type="spellStart"/>
+      <w:proofErr w:type="gramStart"/>
+      <w:r>
+        <w:rPr>
+          <w:lang w:val="es-MX"/>
+        </w:rPr>
+        <w:t>db.getCollection</w:t>
+      </w:r>
+      <w:proofErr w:type="spellEnd"/>
+      <w:proofErr w:type="gramEnd"/>
+      <w:r>
+        <w:rPr>
+          <w:lang w:val="es-MX"/>
+        </w:rPr>
+        <w:t>('ventas'</w:t>
+      </w:r>
+      <w:proofErr w:type="gramStart"/>
+      <w:r>
+        <w:rPr>
+          <w:lang w:val="es-MX"/>
+        </w:rPr>
+        <w:t>).</w:t>
+      </w:r>
+      <w:proofErr w:type="spellStart"/>
+      <w:r>
+        <w:rPr>
+          <w:lang w:val="es-MX"/>
+        </w:rPr>
+        <w:t>aggregate</w:t>
+      </w:r>
+      <w:proofErr w:type="spellEnd"/>
+      <w:proofErr w:type="gramEnd"/>
+      <w:r>
+        <w:rPr>
+          <w:lang w:val="es-MX"/>
+        </w:rPr>
+        <w:t>(</w:t>
       </w:r>
     </w:p>
     <w:p>
@@ -1325,31 +1742,65 @@
         <w:rPr>
           <w:lang w:val="es-MX"/>
         </w:rPr>
-        <w:t xml:space="preserve">          $gte: '2026-05-01',</w:t>
-      </w:r>
-    </w:p>
-    <w:p>
-      <w:pPr>
-        <w:rPr>
-          <w:lang w:val="es-MX"/>
-        </w:rPr>
-      </w:pPr>
-      <w:r>
-        <w:rPr>
-          <w:lang w:val="es-MX"/>
-        </w:rPr>
-        <w:t xml:space="preserve">          $lte: '2026-05-10'</w:t>
-      </w:r>
-    </w:p>
-    <w:p>
-      <w:pPr>
-        <w:rPr>
-          <w:lang w:val="es-MX"/>
-        </w:rPr>
-      </w:pPr>
-      <w:r>
-        <w:rPr>
-          <w:lang w:val="es-MX"/>
+        <w:t xml:space="preserve">          $</w:t>
+      </w:r>
+      <w:proofErr w:type="spellStart"/>
+      <w:r>
+        <w:rPr>
+          <w:lang w:val="es-MX"/>
+        </w:rPr>
+        <w:t>gte</w:t>
+      </w:r>
+      <w:proofErr w:type="spellEnd"/>
+      <w:r>
+        <w:rPr>
+          <w:lang w:val="es-MX"/>
+        </w:rPr>
+        <w:t>: '2026-05-01',</w:t>
+      </w:r>
+    </w:p>
+    <w:p>
+      <w:pPr>
+        <w:rPr>
+          <w:lang w:val="en-US"/>
+        </w:rPr>
+      </w:pPr>
+      <w:r>
+        <w:rPr>
+          <w:lang w:val="es-MX"/>
+        </w:rPr>
+        <w:t xml:space="preserve">          </w:t>
+      </w:r>
+      <w:r>
+        <w:rPr>
+          <w:lang w:val="en-US"/>
+        </w:rPr>
+        <w:t>$</w:t>
+      </w:r>
+      <w:proofErr w:type="spellStart"/>
+      <w:r>
+        <w:rPr>
+          <w:lang w:val="en-US"/>
+        </w:rPr>
+        <w:t>lte</w:t>
+      </w:r>
+      <w:proofErr w:type="spellEnd"/>
+      <w:r>
+        <w:rPr>
+          <w:lang w:val="en-US"/>
+        </w:rPr>
+        <w:t>: '2026-05-10'</w:t>
+      </w:r>
+    </w:p>
+    <w:p>
+      <w:pPr>
+        <w:rPr>
+          <w:lang w:val="en-US"/>
+        </w:rPr>
+      </w:pPr>
+      <w:r>
+        <w:rPr>
+          <w:lang w:val="en-US"/>
         </w:rPr>
         <w:t xml:space="preserve">        }</w:t>
       </w:r>
@@ -1357,12 +1808,12 @@
     <w:p>
       <w:pPr>
         <w:rPr>
-          <w:lang w:val="es-MX"/>
-        </w:rPr>
-      </w:pPr>
-      <w:r>
-        <w:rPr>
-          <w:lang w:val="es-MX"/>
+          <w:lang w:val="en-US"/>
+        </w:rPr>
+      </w:pPr>
+      <w:r>
+        <w:rPr>
+          <w:lang w:val="en-US"/>
         </w:rPr>
         <w:t xml:space="preserve">      }</w:t>
       </w:r>
@@ -1370,12 +1821,12 @@
     <w:p>
       <w:pPr>
         <w:rPr>
-          <w:lang w:val="es-MX"/>
-        </w:rPr>
-      </w:pPr>
-      <w:r>
-        <w:rPr>
-          <w:lang w:val="es-MX"/>
+          <w:lang w:val="en-US"/>
+        </w:rPr>
+      </w:pPr>
+      <w:r>
+        <w:rPr>
+          <w:lang w:val="en-US"/>
         </w:rPr>
         <w:t xml:space="preserve">    },</w:t>
       </w:r>
@@ -1383,25 +1834,53 @@
     <w:p>
       <w:pPr>
         <w:rPr>
-          <w:lang w:val="es-MX"/>
-        </w:rPr>
-      </w:pPr>
-      <w:r>
-        <w:rPr>
-          <w:lang w:val="es-MX"/>
-        </w:rPr>
-        <w:t xml:space="preserve">    { $unwind: '$items' },</w:t>
-      </w:r>
-    </w:p>
-    <w:p>
-      <w:pPr>
-        <w:rPr>
-          <w:lang w:val="es-MX"/>
-        </w:rPr>
-      </w:pPr>
-      <w:r>
-        <w:rPr>
-          <w:lang w:val="es-MX"/>
+          <w:lang w:val="en-US"/>
+        </w:rPr>
+      </w:pPr>
+      <w:r>
+        <w:rPr>
+          <w:lang w:val="en-US"/>
+        </w:rPr>
+        <w:t xml:space="preserve">    </w:t>
+      </w:r>
+      <w:proofErr w:type="gramStart"/>
+      <w:r>
+        <w:rPr>
+          <w:lang w:val="en-US"/>
+        </w:rPr>
+        <w:t>{ $</w:t>
+      </w:r>
+      <w:proofErr w:type="gramEnd"/>
+      <w:r>
+        <w:rPr>
+          <w:lang w:val="en-US"/>
+        </w:rPr>
+        <w:t>unwind: '$items</w:t>
+      </w:r>
+      <w:proofErr w:type="gramStart"/>
+      <w:r>
+        <w:rPr>
+          <w:lang w:val="en-US"/>
+        </w:rPr>
+        <w:t>' }</w:t>
+      </w:r>
+      <w:proofErr w:type="gramEnd"/>
+      <w:r>
+        <w:rPr>
+          <w:lang w:val="en-US"/>
+        </w:rPr>
+        <w:t>,</w:t>
+      </w:r>
+    </w:p>
+    <w:p>
+      <w:pPr>
+        <w:rPr>
+          <w:lang w:val="en-US"/>
+        </w:rPr>
+      </w:pPr>
+      <w:r>
+        <w:rPr>
+          <w:lang w:val="en-US"/>
         </w:rPr>
         <w:t xml:space="preserve">    {</w:t>
       </w:r>
@@ -1409,53 +1888,113 @@
     <w:p>
       <w:pPr>
         <w:rPr>
-          <w:lang w:val="es-MX"/>
-        </w:rPr>
-      </w:pPr>
-      <w:r>
-        <w:rPr>
-          <w:lang w:val="es-MX"/>
-        </w:rPr>
-        <w:t xml:space="preserve">      $group: {</w:t>
-      </w:r>
-    </w:p>
-    <w:p>
-      <w:pPr>
-        <w:rPr>
-          <w:lang w:val="es-MX"/>
-        </w:rPr>
-      </w:pPr>
-      <w:r>
-        <w:rPr>
-          <w:lang w:val="es-MX"/>
-        </w:rPr>
-        <w:t xml:space="preserve">        _id: '$items.producto.tipo',</w:t>
-      </w:r>
-    </w:p>
-    <w:p>
-      <w:pPr>
-        <w:rPr>
-          <w:lang w:val="es-MX"/>
-        </w:rPr>
-      </w:pPr>
-      <w:r>
-        <w:rPr>
-          <w:lang w:val="es-MX"/>
-        </w:rPr>
-        <w:t xml:space="preserve">        cantidadVendida: {</w:t>
-      </w:r>
-    </w:p>
-    <w:p>
-      <w:pPr>
-        <w:rPr>
-          <w:lang w:val="es-MX"/>
-        </w:rPr>
-      </w:pPr>
-      <w:r>
-        <w:rPr>
-          <w:lang w:val="es-MX"/>
-        </w:rPr>
-        <w:t xml:space="preserve">          $sum: '$items.cantidad'</w:t>
+          <w:lang w:val="en-US"/>
+        </w:rPr>
+      </w:pPr>
+      <w:r>
+        <w:rPr>
+          <w:lang w:val="en-US"/>
+        </w:rPr>
+        <w:t xml:space="preserve">      $</w:t>
+      </w:r>
+      <w:proofErr w:type="gramStart"/>
+      <w:r>
+        <w:rPr>
+          <w:lang w:val="en-US"/>
+        </w:rPr>
+        <w:t>group: {</w:t>
+      </w:r>
+      <w:proofErr w:type="gramEnd"/>
+    </w:p>
+    <w:p>
+      <w:pPr>
+        <w:rPr>
+          <w:lang w:val="en-US"/>
+        </w:rPr>
+      </w:pPr>
+      <w:r>
+        <w:rPr>
+          <w:lang w:val="en-US"/>
+        </w:rPr>
+        <w:t xml:space="preserve">        _id: '$</w:t>
+      </w:r>
+      <w:proofErr w:type="spellStart"/>
+      <w:proofErr w:type="gramStart"/>
+      <w:r>
+        <w:rPr>
+          <w:lang w:val="en-US"/>
+        </w:rPr>
+        <w:t>items.producto</w:t>
+      </w:r>
+      <w:proofErr w:type="gramEnd"/>
+      <w:r>
+        <w:rPr>
+          <w:lang w:val="en-US"/>
+        </w:rPr>
+        <w:t>.tipo</w:t>
+      </w:r>
+      <w:proofErr w:type="spellEnd"/>
+      <w:r>
+        <w:rPr>
+          <w:lang w:val="en-US"/>
+        </w:rPr>
+        <w:t>',</w:t>
+      </w:r>
+    </w:p>
+    <w:p>
+      <w:pPr>
+        <w:rPr>
+          <w:lang w:val="es-MX"/>
+        </w:rPr>
+      </w:pPr>
+      <w:r>
+        <w:rPr>
+          <w:lang w:val="en-US"/>
+        </w:rPr>
+        <w:t xml:space="preserve">        </w:t>
+      </w:r>
+      <w:proofErr w:type="spellStart"/>
+      <w:r>
+        <w:rPr>
+          <w:lang w:val="es-MX"/>
+        </w:rPr>
+        <w:t>cantidadVendida</w:t>
+      </w:r>
+      <w:proofErr w:type="spellEnd"/>
+      <w:r>
+        <w:rPr>
+          <w:lang w:val="es-MX"/>
+        </w:rPr>
+        <w:t>: {</w:t>
+      </w:r>
+    </w:p>
+    <w:p>
+      <w:pPr>
+        <w:rPr>
+          <w:lang w:val="es-MX"/>
+        </w:rPr>
+      </w:pPr>
+      <w:r>
+        <w:rPr>
+          <w:lang w:val="es-MX"/>
+        </w:rPr>
+        <w:t xml:space="preserve">          $sum: '$</w:t>
+      </w:r>
+      <w:proofErr w:type="spellStart"/>
+      <w:proofErr w:type="gramStart"/>
+      <w:r>
+        <w:rPr>
+          <w:lang w:val="es-MX"/>
+        </w:rPr>
+        <w:t>items.cantidad</w:t>
+      </w:r>
+      <w:proofErr w:type="spellEnd"/>
+      <w:proofErr w:type="gramEnd"/>
+      <w:r>
+        <w:rPr>
+          <w:lang w:val="es-MX"/>
+        </w:rPr>
+        <w:t>'</w:t>
       </w:r>
     </w:p>
     <w:p>
@@ -1520,8 +2059,52 @@
         <w:rPr>
           <w:lang w:val="es-MX"/>
         </w:rPr>
-        <w:t xml:space="preserve">  { maxTimeMS: 60000, allowDiskUse: true }</w:t>
-      </w:r>
+        <w:t xml:space="preserve">  </w:t>
+      </w:r>
+      <w:proofErr w:type="gramStart"/>
+      <w:r>
+        <w:rPr>
+          <w:lang w:val="es-MX"/>
+        </w:rPr>
+        <w:t xml:space="preserve">{ </w:t>
+      </w:r>
+      <w:proofErr w:type="spellStart"/>
+      <w:r>
+        <w:rPr>
+          <w:lang w:val="es-MX"/>
+        </w:rPr>
+        <w:t>maxTimeMS</w:t>
+      </w:r>
+      <w:proofErr w:type="spellEnd"/>
+      <w:proofErr w:type="gramEnd"/>
+      <w:r>
+        <w:rPr>
+          <w:lang w:val="es-MX"/>
+        </w:rPr>
+        <w:t xml:space="preserve">: 60000, </w:t>
+      </w:r>
+      <w:proofErr w:type="spellStart"/>
+      <w:r>
+        <w:rPr>
+          <w:lang w:val="es-MX"/>
+        </w:rPr>
+        <w:t>allowDiskUse</w:t>
+      </w:r>
+      <w:proofErr w:type="spellEnd"/>
+      <w:r>
+        <w:rPr>
+          <w:lang w:val="es-MX"/>
+        </w:rPr>
+        <w:t xml:space="preserve">: </w:t>
+      </w:r>
+      <w:proofErr w:type="gramStart"/>
+      <w:r>
+        <w:rPr>
+          <w:lang w:val="es-MX"/>
+        </w:rPr>
+        <w:t>true }</w:t>
+      </w:r>
+      <w:proofErr w:type="gramEnd"/>
     </w:p>
     <w:p>
       <w:pPr>
@@ -1547,7 +2130,6 @@
           <w:noProof/>
           <w:lang w:eastAsia="es-AR"/>
         </w:rPr>
-        <w:lastRenderedPageBreak/>
         <w:drawing>
           <wp:inline distT="0" distB="0" distL="0" distR="0" wp14:anchorId="481A6E41" wp14:editId="4FD92A24">
             <wp:extent cx="5414999" cy="2758440"/>
@@ -1564,7 +2146,7 @@
                     <pic:cNvPicPr/>
                   </pic:nvPicPr>
                   <pic:blipFill>
-                    <a:blip r:embed="rId6"/>
+                    <a:blip r:embed="rId5"/>
                     <a:stretch>
                       <a:fillRect/>
                     </a:stretch>
@@ -1624,14 +2206,39 @@
         <w:rPr>
           <w:lang w:val="es-MX"/>
         </w:rPr>
-        <w:t xml:space="preserve"> fechaDesde :  2026-05-01 y </w:t>
-      </w:r>
+        <w:t xml:space="preserve"> </w:t>
+      </w:r>
+      <w:proofErr w:type="spellStart"/>
+      <w:proofErr w:type="gramStart"/>
+      <w:r>
+        <w:rPr>
+          <w:lang w:val="es-MX"/>
+        </w:rPr>
+        <w:t>fechaDesde</w:t>
+      </w:r>
+      <w:proofErr w:type="spellEnd"/>
+      <w:r>
+        <w:rPr>
+          <w:lang w:val="es-MX"/>
+        </w:rPr>
+        <w:t xml:space="preserve"> :</w:t>
+      </w:r>
+      <w:proofErr w:type="gramEnd"/>
+      <w:r>
+        <w:rPr>
+          <w:lang w:val="es-MX"/>
+        </w:rPr>
+        <w:t xml:space="preserve">  2026-05-01 y </w:t>
+      </w:r>
+      <w:proofErr w:type="spellStart"/>
+      <w:proofErr w:type="gramStart"/>
       <w:r>
         <w:rPr>
           <w:lang w:val="es-MX"/>
         </w:rPr>
         <w:t>fechaHasta</w:t>
       </w:r>
+      <w:proofErr w:type="spellEnd"/>
       <w:r>
         <w:rPr>
           <w:lang w:val="es-MX"/>
@@ -1642,8 +2249,9 @@
         <w:rPr>
           <w:lang w:val="es-MX"/>
         </w:rPr>
-        <w:t xml:space="preserve">: </w:t>
-      </w:r>
+        <w:t>:</w:t>
+      </w:r>
+      <w:proofErr w:type="gramEnd"/>
       <w:r>
         <w:rPr>
           <w:lang w:val="es-MX"/>
@@ -1654,10 +2262,14 @@
         <w:rPr>
           <w:lang w:val="es-MX"/>
         </w:rPr>
+        <w:t xml:space="preserve"> </w:t>
+      </w:r>
+      <w:r>
+        <w:rPr>
+          <w:lang w:val="es-MX"/>
+        </w:rPr>
         <w:t>2026-05-31</w:t>
       </w:r>
-      <w:bookmarkStart w:id="0" w:name="_GoBack"/>
-      <w:bookmarkEnd w:id="0"/>
     </w:p>
     <w:p>
       <w:pPr>
@@ -1708,59 +2320,129 @@
         <w:rPr>
           <w:lang w:val="es-MX"/>
         </w:rPr>
-        <w:t xml:space="preserve">      "$expr": {</w:t>
-      </w:r>
-    </w:p>
-    <w:p>
-      <w:pPr>
-        <w:rPr>
-          <w:lang w:val="es-MX"/>
-        </w:rPr>
-      </w:pPr>
-      <w:r>
-        <w:rPr>
-          <w:lang w:val="es-MX"/>
-        </w:rPr>
-        <w:t xml:space="preserve">        "$let": {</w:t>
-      </w:r>
-    </w:p>
-    <w:p>
-      <w:pPr>
-        <w:rPr>
-          <w:lang w:val="es-MX"/>
-        </w:rPr>
-      </w:pPr>
-      <w:r>
-        <w:rPr>
-          <w:lang w:val="es-MX"/>
-        </w:rPr>
-        <w:t xml:space="preserve">          "vars": {</w:t>
-      </w:r>
-    </w:p>
-    <w:p>
-      <w:pPr>
-        <w:rPr>
-          <w:lang w:val="es-MX"/>
-        </w:rPr>
-      </w:pPr>
-      <w:r>
-        <w:rPr>
-          <w:lang w:val="es-MX"/>
-        </w:rPr>
-        <w:t xml:space="preserve">            "fechaDesde": "2026-05-01",</w:t>
-      </w:r>
-    </w:p>
-    <w:p>
-      <w:pPr>
-        <w:rPr>
-          <w:lang w:val="es-MX"/>
-        </w:rPr>
-      </w:pPr>
-      <w:r>
-        <w:rPr>
-          <w:lang w:val="es-MX"/>
-        </w:rPr>
-        <w:t xml:space="preserve">            "fechaHasta": "2026-05-31"</w:t>
+        <w:t xml:space="preserve">      "$</w:t>
+      </w:r>
+      <w:proofErr w:type="spellStart"/>
+      <w:r>
+        <w:rPr>
+          <w:lang w:val="es-MX"/>
+        </w:rPr>
+        <w:t>expr</w:t>
+      </w:r>
+      <w:proofErr w:type="spellEnd"/>
+      <w:r>
+        <w:rPr>
+          <w:lang w:val="es-MX"/>
+        </w:rPr>
+        <w:t>": {</w:t>
+      </w:r>
+    </w:p>
+    <w:p>
+      <w:pPr>
+        <w:rPr>
+          <w:lang w:val="es-MX"/>
+        </w:rPr>
+      </w:pPr>
+      <w:r>
+        <w:rPr>
+          <w:lang w:val="es-MX"/>
+        </w:rPr>
+        <w:t xml:space="preserve">        "$</w:t>
+      </w:r>
+      <w:proofErr w:type="spellStart"/>
+      <w:r>
+        <w:rPr>
+          <w:lang w:val="es-MX"/>
+        </w:rPr>
+        <w:t>let</w:t>
+      </w:r>
+      <w:proofErr w:type="spellEnd"/>
+      <w:r>
+        <w:rPr>
+          <w:lang w:val="es-MX"/>
+        </w:rPr>
+        <w:t>": {</w:t>
+      </w:r>
+    </w:p>
+    <w:p>
+      <w:pPr>
+        <w:rPr>
+          <w:lang w:val="es-MX"/>
+        </w:rPr>
+      </w:pPr>
+      <w:r>
+        <w:rPr>
+          <w:lang w:val="es-MX"/>
+        </w:rPr>
+        <w:t xml:space="preserve">          "</w:t>
+      </w:r>
+      <w:proofErr w:type="spellStart"/>
+      <w:r>
+        <w:rPr>
+          <w:lang w:val="es-MX"/>
+        </w:rPr>
+        <w:t>vars</w:t>
+      </w:r>
+      <w:proofErr w:type="spellEnd"/>
+      <w:r>
+        <w:rPr>
+          <w:lang w:val="es-MX"/>
+        </w:rPr>
+        <w:t>": {</w:t>
+      </w:r>
+    </w:p>
+    <w:p>
+      <w:pPr>
+        <w:rPr>
+          <w:lang w:val="es-MX"/>
+        </w:rPr>
+      </w:pPr>
+      <w:r>
+        <w:rPr>
+          <w:lang w:val="es-MX"/>
+        </w:rPr>
+        <w:t xml:space="preserve">            "</w:t>
+      </w:r>
+      <w:proofErr w:type="spellStart"/>
+      <w:r>
+        <w:rPr>
+          <w:lang w:val="es-MX"/>
+        </w:rPr>
+        <w:t>fechaDesde</w:t>
+      </w:r>
+      <w:proofErr w:type="spellEnd"/>
+      <w:r>
+        <w:rPr>
+          <w:lang w:val="es-MX"/>
+        </w:rPr>
+        <w:t>": "2026-05-01",</w:t>
+      </w:r>
+    </w:p>
+    <w:p>
+      <w:pPr>
+        <w:rPr>
+          <w:lang w:val="es-MX"/>
+        </w:rPr>
+      </w:pPr>
+      <w:r>
+        <w:rPr>
+          <w:lang w:val="es-MX"/>
+        </w:rPr>
+        <w:t xml:space="preserve">            "</w:t>
+      </w:r>
+      <w:proofErr w:type="spellStart"/>
+      <w:r>
+        <w:rPr>
+          <w:lang w:val="es-MX"/>
+        </w:rPr>
+        <w:t>fechaHasta</w:t>
+      </w:r>
+      <w:proofErr w:type="spellEnd"/>
+      <w:r>
+        <w:rPr>
+          <w:lang w:val="es-MX"/>
+        </w:rPr>
+        <w:t>": "2026-05-31"</w:t>
       </w:r>
     </w:p>
     <w:p>
@@ -1812,20 +2494,120 @@
         <w:rPr>
           <w:lang w:val="es-MX"/>
         </w:rPr>
-        <w:t xml:space="preserve">              { "$gte": [ "$fecha", "$$fechaDesde" ] },</w:t>
-      </w:r>
-    </w:p>
-    <w:p>
-      <w:pPr>
-        <w:rPr>
-          <w:lang w:val="es-MX"/>
-        </w:rPr>
-      </w:pPr>
-      <w:r>
-        <w:rPr>
-          <w:lang w:val="es-MX"/>
-        </w:rPr>
-        <w:t xml:space="preserve">              { "$lte": [ "$fecha", "$$fechaHasta" ] }</w:t>
+        <w:t xml:space="preserve">              </w:t>
+      </w:r>
+      <w:proofErr w:type="gramStart"/>
+      <w:r>
+        <w:rPr>
+          <w:lang w:val="es-MX"/>
+        </w:rPr>
+        <w:t>{ "</w:t>
+      </w:r>
+      <w:proofErr w:type="gramEnd"/>
+      <w:r>
+        <w:rPr>
+          <w:lang w:val="es-MX"/>
+        </w:rPr>
+        <w:t>$</w:t>
+      </w:r>
+      <w:proofErr w:type="spellStart"/>
+      <w:r>
+        <w:rPr>
+          <w:lang w:val="es-MX"/>
+        </w:rPr>
+        <w:t>gte</w:t>
+      </w:r>
+      <w:proofErr w:type="spellEnd"/>
+      <w:r>
+        <w:rPr>
+          <w:lang w:val="es-MX"/>
+        </w:rPr>
+        <w:t>": [ "$fecha", "$$</w:t>
+      </w:r>
+      <w:proofErr w:type="spellStart"/>
+      <w:r>
+        <w:rPr>
+          <w:lang w:val="es-MX"/>
+        </w:rPr>
+        <w:t>fechaDesde</w:t>
+      </w:r>
+      <w:proofErr w:type="spellEnd"/>
+      <w:proofErr w:type="gramStart"/>
+      <w:r>
+        <w:rPr>
+          <w:lang w:val="es-MX"/>
+        </w:rPr>
+        <w:t>" ]</w:t>
+      </w:r>
+      <w:proofErr w:type="gramEnd"/>
+      <w:r>
+        <w:rPr>
+          <w:lang w:val="es-MX"/>
+        </w:rPr>
+        <w:t xml:space="preserve"> },</w:t>
+      </w:r>
+    </w:p>
+    <w:p>
+      <w:pPr>
+        <w:rPr>
+          <w:lang w:val="es-MX"/>
+        </w:rPr>
+      </w:pPr>
+      <w:r>
+        <w:rPr>
+          <w:lang w:val="es-MX"/>
+        </w:rPr>
+        <w:t xml:space="preserve">              </w:t>
+      </w:r>
+      <w:proofErr w:type="gramStart"/>
+      <w:r>
+        <w:rPr>
+          <w:lang w:val="es-MX"/>
+        </w:rPr>
+        <w:t>{ "</w:t>
+      </w:r>
+      <w:proofErr w:type="gramEnd"/>
+      <w:r>
+        <w:rPr>
+          <w:lang w:val="es-MX"/>
+        </w:rPr>
+        <w:t>$</w:t>
+      </w:r>
+      <w:proofErr w:type="spellStart"/>
+      <w:r>
+        <w:rPr>
+          <w:lang w:val="es-MX"/>
+        </w:rPr>
+        <w:t>lte</w:t>
+      </w:r>
+      <w:proofErr w:type="spellEnd"/>
+      <w:r>
+        <w:rPr>
+          <w:lang w:val="es-MX"/>
+        </w:rPr>
+        <w:t>": [ "$fecha", "$$</w:t>
+      </w:r>
+      <w:proofErr w:type="spellStart"/>
+      <w:r>
+        <w:rPr>
+          <w:lang w:val="es-MX"/>
+        </w:rPr>
+        <w:t>fechaHasta</w:t>
+      </w:r>
+      <w:proofErr w:type="spellEnd"/>
+      <w:proofErr w:type="gramStart"/>
+      <w:r>
+        <w:rPr>
+          <w:lang w:val="es-MX"/>
+        </w:rPr>
+        <w:t>" ]</w:t>
+      </w:r>
+      <w:proofErr w:type="gramEnd"/>
+      <w:r>
+        <w:rPr>
+          <w:lang w:val="es-MX"/>
+        </w:rPr>
+        <w:t xml:space="preserve"> }</w:t>
       </w:r>
     </w:p>
     <w:p>
@@ -1903,7 +2685,6 @@
         <w:rPr>
           <w:lang w:val="es-MX"/>
         </w:rPr>
-        <w:lastRenderedPageBreak/>
         <w:t xml:space="preserve">  },</w:t>
       </w:r>
     </w:p>
@@ -1930,20 +2711,48 @@
         <w:rPr>
           <w:lang w:val="es-MX"/>
         </w:rPr>
-        <w:t xml:space="preserve">    "$facet": {</w:t>
-      </w:r>
-    </w:p>
-    <w:p>
-      <w:pPr>
-        <w:rPr>
-          <w:lang w:val="es-MX"/>
-        </w:rPr>
-      </w:pPr>
-      <w:r>
-        <w:rPr>
-          <w:lang w:val="es-MX"/>
-        </w:rPr>
-        <w:t xml:space="preserve">      "totalCadena": [</w:t>
+        <w:t xml:space="preserve">    "$</w:t>
+      </w:r>
+      <w:proofErr w:type="spellStart"/>
+      <w:r>
+        <w:rPr>
+          <w:lang w:val="es-MX"/>
+        </w:rPr>
+        <w:t>facet</w:t>
+      </w:r>
+      <w:proofErr w:type="spellEnd"/>
+      <w:r>
+        <w:rPr>
+          <w:lang w:val="es-MX"/>
+        </w:rPr>
+        <w:t>": {</w:t>
+      </w:r>
+    </w:p>
+    <w:p>
+      <w:pPr>
+        <w:rPr>
+          <w:lang w:val="es-MX"/>
+        </w:rPr>
+      </w:pPr>
+      <w:r>
+        <w:rPr>
+          <w:lang w:val="es-MX"/>
+        </w:rPr>
+        <w:t xml:space="preserve">      "</w:t>
+      </w:r>
+      <w:proofErr w:type="spellStart"/>
+      <w:r>
+        <w:rPr>
+          <w:lang w:val="es-MX"/>
+        </w:rPr>
+        <w:t>totalCadena</w:t>
+      </w:r>
+      <w:proofErr w:type="spellEnd"/>
+      <w:r>
+        <w:rPr>
+          <w:lang w:val="es-MX"/>
+        </w:rPr>
+        <w:t>": [</w:t>
       </w:r>
     </w:p>
     <w:p>
@@ -1969,34 +2778,106 @@
         <w:rPr>
           <w:lang w:val="es-MX"/>
         </w:rPr>
-        <w:t xml:space="preserve">          "$group": {</w:t>
-      </w:r>
-    </w:p>
-    <w:p>
-      <w:pPr>
-        <w:rPr>
-          <w:lang w:val="es-MX"/>
-        </w:rPr>
-      </w:pPr>
-      <w:r>
-        <w:rPr>
-          <w:lang w:val="es-MX"/>
-        </w:rPr>
-        <w:t xml:space="preserve">            "_id": null,</w:t>
-      </w:r>
-    </w:p>
-    <w:p>
-      <w:pPr>
-        <w:rPr>
-          <w:lang w:val="es-MX"/>
-        </w:rPr>
-      </w:pPr>
-      <w:r>
-        <w:rPr>
-          <w:lang w:val="es-MX"/>
-        </w:rPr>
-        <w:t xml:space="preserve">            "totalCobranza": { "$sum": "$totalVenta" }</w:t>
-      </w:r>
+        <w:t xml:space="preserve">          "$</w:t>
+      </w:r>
+      <w:proofErr w:type="spellStart"/>
+      <w:r>
+        <w:rPr>
+          <w:lang w:val="es-MX"/>
+        </w:rPr>
+        <w:t>group</w:t>
+      </w:r>
+      <w:proofErr w:type="spellEnd"/>
+      <w:r>
+        <w:rPr>
+          <w:lang w:val="es-MX"/>
+        </w:rPr>
+        <w:t>": {</w:t>
+      </w:r>
+    </w:p>
+    <w:p>
+      <w:pPr>
+        <w:rPr>
+          <w:lang w:val="es-MX"/>
+        </w:rPr>
+      </w:pPr>
+      <w:r>
+        <w:rPr>
+          <w:lang w:val="es-MX"/>
+        </w:rPr>
+        <w:t xml:space="preserve">            "_id": </w:t>
+      </w:r>
+      <w:proofErr w:type="spellStart"/>
+      <w:r>
+        <w:rPr>
+          <w:lang w:val="es-MX"/>
+        </w:rPr>
+        <w:t>null</w:t>
+      </w:r>
+      <w:proofErr w:type="spellEnd"/>
+      <w:r>
+        <w:rPr>
+          <w:lang w:val="es-MX"/>
+        </w:rPr>
+        <w:t>,</w:t>
+      </w:r>
+    </w:p>
+    <w:p>
+      <w:pPr>
+        <w:rPr>
+          <w:lang w:val="es-MX"/>
+        </w:rPr>
+      </w:pPr>
+      <w:r>
+        <w:rPr>
+          <w:lang w:val="es-MX"/>
+        </w:rPr>
+        <w:t xml:space="preserve">            "</w:t>
+      </w:r>
+      <w:proofErr w:type="spellStart"/>
+      <w:r>
+        <w:rPr>
+          <w:lang w:val="es-MX"/>
+        </w:rPr>
+        <w:t>totalCobranza</w:t>
+      </w:r>
+      <w:proofErr w:type="spellEnd"/>
+      <w:r>
+        <w:rPr>
+          <w:lang w:val="es-MX"/>
+        </w:rPr>
+        <w:t xml:space="preserve">": </w:t>
+      </w:r>
+      <w:proofErr w:type="gramStart"/>
+      <w:r>
+        <w:rPr>
+          <w:lang w:val="es-MX"/>
+        </w:rPr>
+        <w:t>{ "</w:t>
+      </w:r>
+      <w:proofErr w:type="gramEnd"/>
+      <w:r>
+        <w:rPr>
+          <w:lang w:val="es-MX"/>
+        </w:rPr>
+        <w:t>$sum": "$</w:t>
+      </w:r>
+      <w:proofErr w:type="spellStart"/>
+      <w:r>
+        <w:rPr>
+          <w:lang w:val="es-MX"/>
+        </w:rPr>
+        <w:t>totalVenta</w:t>
+      </w:r>
+      <w:proofErr w:type="spellEnd"/>
+      <w:proofErr w:type="gramStart"/>
+      <w:r>
+        <w:rPr>
+          <w:lang w:val="es-MX"/>
+        </w:rPr>
+        <w:t>" }</w:t>
+      </w:r>
+      <w:proofErr w:type="gramEnd"/>
     </w:p>
     <w:p>
       <w:pPr>
@@ -2047,7 +2928,21 @@
         <w:rPr>
           <w:lang w:val="es-MX"/>
         </w:rPr>
-        <w:t xml:space="preserve">      "porSucursal": [</w:t>
+        <w:t xml:space="preserve">      "</w:t>
+      </w:r>
+      <w:proofErr w:type="spellStart"/>
+      <w:r>
+        <w:rPr>
+          <w:lang w:val="es-MX"/>
+        </w:rPr>
+        <w:t>porSucursal</w:t>
+      </w:r>
+      <w:proofErr w:type="spellEnd"/>
+      <w:r>
+        <w:rPr>
+          <w:lang w:val="es-MX"/>
+        </w:rPr>
+        <w:t>": [</w:t>
       </w:r>
     </w:p>
     <w:p>
@@ -2073,7 +2968,21 @@
         <w:rPr>
           <w:lang w:val="es-MX"/>
         </w:rPr>
-        <w:t xml:space="preserve">          "$group": {</w:t>
+        <w:t xml:space="preserve">          "$</w:t>
+      </w:r>
+      <w:proofErr w:type="spellStart"/>
+      <w:r>
+        <w:rPr>
+          <w:lang w:val="es-MX"/>
+        </w:rPr>
+        <w:t>group</w:t>
+      </w:r>
+      <w:proofErr w:type="spellEnd"/>
+      <w:r>
+        <w:rPr>
+          <w:lang w:val="es-MX"/>
+        </w:rPr>
+        <w:t>": {</w:t>
       </w:r>
     </w:p>
     <w:p>
@@ -2099,31 +3008,81 @@
         <w:rPr>
           <w:lang w:val="es-MX"/>
         </w:rPr>
-        <w:t xml:space="preserve">            "totalCobranza": { "$sum": "$totalVenta" }</w:t>
-      </w:r>
-    </w:p>
-    <w:p>
-      <w:pPr>
-        <w:rPr>
-          <w:lang w:val="es-MX"/>
-        </w:rPr>
-      </w:pPr>
-      <w:r>
-        <w:rPr>
-          <w:lang w:val="es-MX"/>
-        </w:rPr>
-        <w:t xml:space="preserve">          }</w:t>
-      </w:r>
-    </w:p>
-    <w:p>
-      <w:pPr>
-        <w:rPr>
-          <w:lang w:val="es-MX"/>
-        </w:rPr>
-      </w:pPr>
-      <w:r>
-        <w:rPr>
-          <w:lang w:val="es-MX"/>
+        <w:t xml:space="preserve">            "</w:t>
+      </w:r>
+      <w:proofErr w:type="spellStart"/>
+      <w:r>
+        <w:rPr>
+          <w:lang w:val="es-MX"/>
+        </w:rPr>
+        <w:t>totalCobranza</w:t>
+      </w:r>
+      <w:proofErr w:type="spellEnd"/>
+      <w:r>
+        <w:rPr>
+          <w:lang w:val="es-MX"/>
+        </w:rPr>
+        <w:t xml:space="preserve">": </w:t>
+      </w:r>
+      <w:proofErr w:type="gramStart"/>
+      <w:r>
+        <w:rPr>
+          <w:lang w:val="es-MX"/>
+        </w:rPr>
+        <w:t>{ "</w:t>
+      </w:r>
+      <w:proofErr w:type="gramEnd"/>
+      <w:r>
+        <w:rPr>
+          <w:lang w:val="es-MX"/>
+        </w:rPr>
+        <w:t>$sum": "$</w:t>
+      </w:r>
+      <w:proofErr w:type="spellStart"/>
+      <w:r>
+        <w:rPr>
+          <w:lang w:val="es-MX"/>
+        </w:rPr>
+        <w:t>totalVenta</w:t>
+      </w:r>
+      <w:proofErr w:type="spellEnd"/>
+      <w:proofErr w:type="gramStart"/>
+      <w:r>
+        <w:rPr>
+          <w:lang w:val="es-MX"/>
+        </w:rPr>
+        <w:t>" }</w:t>
+      </w:r>
+      <w:proofErr w:type="gramEnd"/>
+    </w:p>
+    <w:p>
+      <w:pPr>
+        <w:rPr>
+          <w:lang w:val="en-US"/>
+        </w:rPr>
+      </w:pPr>
+      <w:r>
+        <w:rPr>
+          <w:lang w:val="es-MX"/>
+        </w:rPr>
+        <w:t xml:space="preserve">          </w:t>
+      </w:r>
+      <w:r>
+        <w:rPr>
+          <w:lang w:val="en-US"/>
+        </w:rPr>
+        <w:t>}</w:t>
+      </w:r>
+    </w:p>
+    <w:p>
+      <w:pPr>
+        <w:rPr>
+          <w:lang w:val="en-US"/>
+        </w:rPr>
+      </w:pPr>
+      <w:r>
+        <w:rPr>
+          <w:lang w:val="en-US"/>
         </w:rPr>
         <w:t xml:space="preserve">        }</w:t>
       </w:r>
@@ -2131,12 +3090,12 @@
     <w:p>
       <w:pPr>
         <w:rPr>
-          <w:lang w:val="es-MX"/>
-        </w:rPr>
-      </w:pPr>
-      <w:r>
-        <w:rPr>
-          <w:lang w:val="es-MX"/>
+          <w:lang w:val="en-US"/>
+        </w:rPr>
+      </w:pPr>
+      <w:r>
+        <w:rPr>
+          <w:lang w:val="en-US"/>
         </w:rPr>
         <w:t xml:space="preserve">      ]</w:t>
       </w:r>
@@ -2144,12 +3103,12 @@
     <w:p>
       <w:pPr>
         <w:rPr>
-          <w:lang w:val="es-MX"/>
-        </w:rPr>
-      </w:pPr>
-      <w:r>
-        <w:rPr>
-          <w:lang w:val="es-MX"/>
+          <w:lang w:val="en-US"/>
+        </w:rPr>
+      </w:pPr>
+      <w:r>
+        <w:rPr>
+          <w:lang w:val="en-US"/>
         </w:rPr>
         <w:t xml:space="preserve">    }</w:t>
       </w:r>
@@ -2157,12 +3116,12 @@
     <w:p>
       <w:pPr>
         <w:rPr>
-          <w:lang w:val="es-MX"/>
-        </w:rPr>
-      </w:pPr>
-      <w:r>
-        <w:rPr>
-          <w:lang w:val="es-MX"/>
+          <w:lang w:val="en-US"/>
+        </w:rPr>
+      </w:pPr>
+      <w:r>
+        <w:rPr>
+          <w:lang w:val="en-US"/>
         </w:rPr>
         <w:t xml:space="preserve">  }</w:t>
       </w:r>
@@ -2170,22 +3129,14 @@
     <w:p>
       <w:pPr>
         <w:rPr>
-          <w:lang w:val="es-MX"/>
-        </w:rPr>
-      </w:pPr>
-      <w:r>
-        <w:rPr>
-          <w:lang w:val="es-MX"/>
-        </w:rPr>
-        <w:lastRenderedPageBreak/>
-        <w:t>]</w:t>
-      </w:r>
-      <w:r>
-        <w:rPr>
-          <w:noProof/>
-          <w:lang w:eastAsia="es-AR"/>
-        </w:rPr>
-        <w:t xml:space="preserve"> </w:t>
+          <w:lang w:val="en-US"/>
+        </w:rPr>
+      </w:pPr>
+      <w:r>
+        <w:rPr>
+          <w:lang w:val="en-US"/>
+        </w:rPr>
+        <w:t xml:space="preserve">] </w:t>
       </w:r>
       <w:r>
         <w:rPr>
@@ -2208,7 +3159,7 @@
                     <pic:cNvPicPr/>
                   </pic:nvPicPr>
                   <pic:blipFill>
-                    <a:blip r:embed="rId7"/>
+                    <a:blip r:embed="rId6"/>
                     <a:stretch>
                       <a:fillRect/>
                     </a:stretch>
@@ -2229,6 +3180,855 @@
         </w:drawing>
       </w:r>
     </w:p>
+    <w:p>
+      <w:pPr>
+        <w:rPr>
+          <w:lang w:val="en-US"/>
+        </w:rPr>
+      </w:pPr>
+      <w:r>
+        <w:rPr>
+          <w:lang w:val="en-US"/>
+        </w:rPr>
+        <w:br w:type="page"/>
+      </w:r>
+    </w:p>
+    <w:p>
+      <w:pPr>
+        <w:rPr>
+          <w:lang w:val="en-US"/>
+        </w:rPr>
+      </w:pPr>
+      <w:r>
+        <w:rPr>
+          <w:b/>
+          <w:lang w:val="en-US"/>
+        </w:rPr>
+        <w:t>CONSULTA 5:</w:t>
+      </w:r>
+    </w:p>
+    <w:p>
+      <w:pPr>
+        <w:rPr>
+          <w:lang w:val="en-US"/>
+        </w:rPr>
+      </w:pPr>
+      <w:r>
+        <w:rPr>
+          <w:lang w:val="en-US"/>
+        </w:rPr>
+        <w:t>[</w:t>
+      </w:r>
+    </w:p>
+    <w:p>
+      <w:pPr>
+        <w:rPr>
+          <w:lang w:val="en-US"/>
+        </w:rPr>
+      </w:pPr>
+      <w:r>
+        <w:rPr>
+          <w:lang w:val="en-US"/>
+        </w:rPr>
+        <w:t xml:space="preserve"> {</w:t>
+      </w:r>
+    </w:p>
+    <w:p>
+      <w:pPr>
+        <w:rPr>
+          <w:lang w:val="en-US"/>
+        </w:rPr>
+      </w:pPr>
+      <w:r>
+        <w:rPr>
+          <w:lang w:val="en-US"/>
+        </w:rPr>
+        <w:t xml:space="preserve">  $unwind: "$items"</w:t>
+      </w:r>
+    </w:p>
+    <w:p>
+      <w:pPr>
+        <w:rPr>
+          <w:lang w:val="en-US"/>
+        </w:rPr>
+      </w:pPr>
+      <w:r>
+        <w:rPr>
+          <w:lang w:val="en-US"/>
+        </w:rPr>
+        <w:t xml:space="preserve"> },</w:t>
+      </w:r>
+    </w:p>
+    <w:p>
+      <w:pPr>
+        <w:rPr>
+          <w:lang w:val="en-US"/>
+        </w:rPr>
+      </w:pPr>
+      <w:r>
+        <w:rPr>
+          <w:lang w:val="en-US"/>
+        </w:rPr>
+        <w:t xml:space="preserve"> {</w:t>
+      </w:r>
+    </w:p>
+    <w:p>
+      <w:pPr>
+        <w:rPr>
+          <w:lang w:val="en-US"/>
+        </w:rPr>
+      </w:pPr>
+      <w:r>
+        <w:rPr>
+          <w:lang w:val="en-US"/>
+        </w:rPr>
+        <w:t xml:space="preserve">  $</w:t>
+      </w:r>
+      <w:proofErr w:type="gramStart"/>
+      <w:r>
+        <w:rPr>
+          <w:lang w:val="en-US"/>
+        </w:rPr>
+        <w:t>group: {</w:t>
+      </w:r>
+      <w:proofErr w:type="gramEnd"/>
+    </w:p>
+    <w:p>
+      <w:pPr>
+        <w:rPr>
+          <w:lang w:val="en-US"/>
+        </w:rPr>
+      </w:pPr>
+      <w:r>
+        <w:rPr>
+          <w:lang w:val="en-US"/>
+        </w:rPr>
+        <w:t xml:space="preserve">   _</w:t>
+      </w:r>
+      <w:proofErr w:type="gramStart"/>
+      <w:r>
+        <w:rPr>
+          <w:lang w:val="en-US"/>
+        </w:rPr>
+        <w:t>id: {</w:t>
+      </w:r>
+      <w:proofErr w:type="gramEnd"/>
+    </w:p>
+    <w:p>
+      <w:r>
+        <w:rPr>
+          <w:lang w:val="en-US"/>
+        </w:rPr>
+        <w:t xml:space="preserve">    </w:t>
+      </w:r>
+      <w:r>
+        <w:t>sucursal: "$</w:t>
+      </w:r>
+      <w:proofErr w:type="spellStart"/>
+      <w:proofErr w:type="gramStart"/>
+      <w:r>
+        <w:t>sucursal.puntoVenta</w:t>
+      </w:r>
+      <w:proofErr w:type="spellEnd"/>
+      <w:proofErr w:type="gramEnd"/>
+      <w:r>
+        <w:t>",</w:t>
+      </w:r>
+    </w:p>
+    <w:p>
+      <w:r>
+        <w:t xml:space="preserve">    </w:t>
+      </w:r>
+      <w:proofErr w:type="spellStart"/>
+      <w:r>
+        <w:t>codigoProducto</w:t>
+      </w:r>
+      <w:proofErr w:type="spellEnd"/>
+      <w:r>
+        <w:t>: "$</w:t>
+      </w:r>
+      <w:proofErr w:type="spellStart"/>
+      <w:proofErr w:type="gramStart"/>
+      <w:r>
+        <w:t>items.producto</w:t>
+      </w:r>
+      <w:proofErr w:type="gramEnd"/>
+      <w:r>
+        <w:t>.codigo</w:t>
+      </w:r>
+      <w:proofErr w:type="spellEnd"/>
+      <w:r>
+        <w:t>",</w:t>
+      </w:r>
+    </w:p>
+    <w:p>
+      <w:r>
+        <w:t xml:space="preserve">    producto: "$</w:t>
+      </w:r>
+      <w:proofErr w:type="spellStart"/>
+      <w:proofErr w:type="gramStart"/>
+      <w:r>
+        <w:t>items.producto</w:t>
+      </w:r>
+      <w:proofErr w:type="gramEnd"/>
+      <w:r>
+        <w:t>.descripcion</w:t>
+      </w:r>
+      <w:proofErr w:type="spellEnd"/>
+      <w:r>
+        <w:t>"</w:t>
+      </w:r>
+    </w:p>
+    <w:p>
+      <w:r>
+        <w:t xml:space="preserve">   },</w:t>
+      </w:r>
+    </w:p>
+    <w:p>
+      <w:r>
+        <w:t xml:space="preserve">   </w:t>
+      </w:r>
+      <w:proofErr w:type="spellStart"/>
+      <w:r>
+        <w:t>montoVendido</w:t>
+      </w:r>
+      <w:proofErr w:type="spellEnd"/>
+      <w:r>
+        <w:t xml:space="preserve">: </w:t>
+      </w:r>
+      <w:proofErr w:type="gramStart"/>
+      <w:r>
+        <w:t>{ $</w:t>
+      </w:r>
+      <w:proofErr w:type="gramEnd"/>
+      <w:r>
+        <w:t>sum: "$</w:t>
+      </w:r>
+      <w:proofErr w:type="spellStart"/>
+      <w:proofErr w:type="gramStart"/>
+      <w:r>
+        <w:t>items.total</w:t>
+      </w:r>
+      <w:proofErr w:type="spellEnd"/>
+      <w:r>
+        <w:t>" }</w:t>
+      </w:r>
+      <w:proofErr w:type="gramEnd"/>
+    </w:p>
+    <w:p>
+      <w:r>
+        <w:t xml:space="preserve">  }</w:t>
+      </w:r>
+    </w:p>
+    <w:p>
+      <w:r>
+        <w:t xml:space="preserve"> },</w:t>
+      </w:r>
+    </w:p>
+    <w:p>
+      <w:r>
+        <w:t xml:space="preserve"> </w:t>
+      </w:r>
+      <w:proofErr w:type="gramStart"/>
+      <w:r>
+        <w:t>{ $</w:t>
+      </w:r>
+      <w:proofErr w:type="spellStart"/>
+      <w:proofErr w:type="gramEnd"/>
+      <w:r>
+        <w:t>sort</w:t>
+      </w:r>
+      <w:proofErr w:type="spellEnd"/>
+      <w:r>
+        <w:t xml:space="preserve">: </w:t>
+      </w:r>
+      <w:proofErr w:type="gramStart"/>
+      <w:r>
+        <w:t xml:space="preserve">{ </w:t>
+      </w:r>
+      <w:proofErr w:type="spellStart"/>
+      <w:r>
+        <w:t>montoVendido</w:t>
+      </w:r>
+      <w:proofErr w:type="spellEnd"/>
+      <w:proofErr w:type="gramEnd"/>
+      <w:r>
+        <w:t>: -</w:t>
+      </w:r>
+      <w:proofErr w:type="gramStart"/>
+      <w:r>
+        <w:t>1 }</w:t>
+      </w:r>
+      <w:proofErr w:type="gramEnd"/>
+      <w:r>
+        <w:t xml:space="preserve"> },</w:t>
+      </w:r>
+    </w:p>
+    <w:p>
+      <w:r>
+        <w:t xml:space="preserve"> {</w:t>
+      </w:r>
+    </w:p>
+    <w:p>
+      <w:r>
+        <w:t xml:space="preserve">  $</w:t>
+      </w:r>
+      <w:proofErr w:type="spellStart"/>
+      <w:r>
+        <w:t>project</w:t>
+      </w:r>
+      <w:proofErr w:type="spellEnd"/>
+      <w:r>
+        <w:t>: {</w:t>
+      </w:r>
+    </w:p>
+    <w:p>
+      <w:r>
+        <w:t xml:space="preserve">   _id: 0,</w:t>
+      </w:r>
+    </w:p>
+    <w:p>
+      <w:r>
+        <w:t xml:space="preserve">   sucursal: "$_</w:t>
+      </w:r>
+      <w:proofErr w:type="spellStart"/>
+      <w:proofErr w:type="gramStart"/>
+      <w:r>
+        <w:t>id.sucursal</w:t>
+      </w:r>
+      <w:proofErr w:type="spellEnd"/>
+      <w:proofErr w:type="gramEnd"/>
+      <w:r>
+        <w:t>",</w:t>
+      </w:r>
+    </w:p>
+    <w:p>
+      <w:r>
+        <w:t xml:space="preserve">   </w:t>
+      </w:r>
+      <w:proofErr w:type="spellStart"/>
+      <w:r>
+        <w:t>codigoProducto</w:t>
+      </w:r>
+      <w:proofErr w:type="spellEnd"/>
+      <w:r>
+        <w:t>: "$_</w:t>
+      </w:r>
+      <w:proofErr w:type="spellStart"/>
+      <w:proofErr w:type="gramStart"/>
+      <w:r>
+        <w:t>id.codigoProducto</w:t>
+      </w:r>
+      <w:proofErr w:type="spellEnd"/>
+      <w:proofErr w:type="gramEnd"/>
+      <w:r>
+        <w:t>",</w:t>
+      </w:r>
+    </w:p>
+    <w:p>
+      <w:r>
+        <w:t xml:space="preserve">   producto: "$_</w:t>
+      </w:r>
+      <w:proofErr w:type="spellStart"/>
+      <w:proofErr w:type="gramStart"/>
+      <w:r>
+        <w:t>id.producto</w:t>
+      </w:r>
+      <w:proofErr w:type="spellEnd"/>
+      <w:proofErr w:type="gramEnd"/>
+      <w:r>
+        <w:t>",</w:t>
+      </w:r>
+    </w:p>
+    <w:p>
+      <w:r>
+        <w:t xml:space="preserve">   </w:t>
+      </w:r>
+      <w:proofErr w:type="spellStart"/>
+      <w:r>
+        <w:t>montoVendido</w:t>
+      </w:r>
+      <w:proofErr w:type="spellEnd"/>
+      <w:r>
+        <w:t>: 1</w:t>
+      </w:r>
+    </w:p>
+    <w:p>
+      <w:r>
+        <w:t xml:space="preserve">  }</w:t>
+      </w:r>
+    </w:p>
+    <w:p>
+      <w:r>
+        <w:t xml:space="preserve"> }</w:t>
+      </w:r>
+    </w:p>
+    <w:p>
+      <w:r>
+        <w:t>]</w:t>
+      </w:r>
+    </w:p>
+    <w:p>
+      <w:r>
+        <w:rPr>
+          <w:noProof/>
+        </w:rPr>
+        <w:drawing>
+          <wp:inline distT="0" distB="0" distL="0" distR="0" wp14:anchorId="2146B8D3" wp14:editId="312D2BED">
+            <wp:extent cx="5303520" cy="2882235"/>
+            <wp:effectExtent l="0" t="0" r="0" b="0"/>
+            <wp:docPr id="4" name="Picture 4"/>
+            <wp:cNvGraphicFramePr>
+              <a:graphicFrameLocks xmlns:a="http://schemas.openxmlformats.org/drawingml/2006/main" noChangeAspect="1"/>
+            </wp:cNvGraphicFramePr>
+            <a:graphic xmlns:a="http://schemas.openxmlformats.org/drawingml/2006/main">
+              <a:graphicData uri="http://schemas.openxmlformats.org/drawingml/2006/picture">
+                <pic:pic xmlns:pic="http://schemas.openxmlformats.org/drawingml/2006/picture">
+                  <pic:nvPicPr>
+                    <pic:cNvPr id="0" name="image(122).png"/>
+                    <pic:cNvPicPr/>
+                  </pic:nvPicPr>
+                  <pic:blipFill>
+                    <a:blip r:embed="rId7"/>
+                    <a:stretch>
+                      <a:fillRect/>
+                    </a:stretch>
+                  </pic:blipFill>
+                  <pic:spPr>
+                    <a:xfrm>
+                      <a:off x="0" y="0"/>
+                      <a:ext cx="5303520" cy="2882235"/>
+                    </a:xfrm>
+                    <a:prstGeom prst="rect">
+                      <a:avLst/>
+                    </a:prstGeom>
+                  </pic:spPr>
+                </pic:pic>
+              </a:graphicData>
+            </a:graphic>
+          </wp:inline>
+        </w:drawing>
+      </w:r>
+    </w:p>
+    <w:p/>
+    <w:p>
+      <w:pPr>
+        <w:rPr>
+          <w:lang w:val="en-US"/>
+        </w:rPr>
+      </w:pPr>
+      <w:r>
+        <w:rPr>
+          <w:b/>
+          <w:lang w:val="en-US"/>
+        </w:rPr>
+        <w:t>CONSULTA 6:</w:t>
+      </w:r>
+    </w:p>
+    <w:p>
+      <w:pPr>
+        <w:rPr>
+          <w:lang w:val="en-US"/>
+        </w:rPr>
+      </w:pPr>
+      <w:r>
+        <w:rPr>
+          <w:lang w:val="en-US"/>
+        </w:rPr>
+        <w:t>[</w:t>
+      </w:r>
+    </w:p>
+    <w:p>
+      <w:pPr>
+        <w:rPr>
+          <w:lang w:val="en-US"/>
+        </w:rPr>
+      </w:pPr>
+      <w:r>
+        <w:rPr>
+          <w:lang w:val="en-US"/>
+        </w:rPr>
+        <w:t xml:space="preserve"> {</w:t>
+      </w:r>
+    </w:p>
+    <w:p>
+      <w:pPr>
+        <w:rPr>
+          <w:lang w:val="en-US"/>
+        </w:rPr>
+      </w:pPr>
+      <w:r>
+        <w:rPr>
+          <w:lang w:val="en-US"/>
+        </w:rPr>
+        <w:t xml:space="preserve">  $unwind: "$items"</w:t>
+      </w:r>
+    </w:p>
+    <w:p>
+      <w:pPr>
+        <w:rPr>
+          <w:lang w:val="en-US"/>
+        </w:rPr>
+      </w:pPr>
+      <w:r>
+        <w:rPr>
+          <w:lang w:val="en-US"/>
+        </w:rPr>
+        <w:t xml:space="preserve"> },</w:t>
+      </w:r>
+    </w:p>
+    <w:p>
+      <w:pPr>
+        <w:rPr>
+          <w:lang w:val="en-US"/>
+        </w:rPr>
+      </w:pPr>
+      <w:r>
+        <w:rPr>
+          <w:lang w:val="en-US"/>
+        </w:rPr>
+        <w:t xml:space="preserve"> {</w:t>
+      </w:r>
+    </w:p>
+    <w:p>
+      <w:pPr>
+        <w:rPr>
+          <w:lang w:val="en-US"/>
+        </w:rPr>
+      </w:pPr>
+      <w:r>
+        <w:rPr>
+          <w:lang w:val="en-US"/>
+        </w:rPr>
+        <w:t xml:space="preserve">  $</w:t>
+      </w:r>
+      <w:proofErr w:type="gramStart"/>
+      <w:r>
+        <w:rPr>
+          <w:lang w:val="en-US"/>
+        </w:rPr>
+        <w:t>group: {</w:t>
+      </w:r>
+      <w:proofErr w:type="gramEnd"/>
+    </w:p>
+    <w:p>
+      <w:pPr>
+        <w:rPr>
+          <w:lang w:val="en-US"/>
+        </w:rPr>
+      </w:pPr>
+      <w:r>
+        <w:rPr>
+          <w:lang w:val="en-US"/>
+        </w:rPr>
+        <w:t xml:space="preserve">   _</w:t>
+      </w:r>
+      <w:proofErr w:type="gramStart"/>
+      <w:r>
+        <w:rPr>
+          <w:lang w:val="en-US"/>
+        </w:rPr>
+        <w:t>id: {</w:t>
+      </w:r>
+      <w:proofErr w:type="gramEnd"/>
+    </w:p>
+    <w:p>
+      <w:r>
+        <w:rPr>
+          <w:lang w:val="en-US"/>
+        </w:rPr>
+        <w:t xml:space="preserve">    </w:t>
+      </w:r>
+      <w:r>
+        <w:t>sucursal: "$</w:t>
+      </w:r>
+      <w:proofErr w:type="spellStart"/>
+      <w:proofErr w:type="gramStart"/>
+      <w:r>
+        <w:t>sucursal.puntoVenta</w:t>
+      </w:r>
+      <w:proofErr w:type="spellEnd"/>
+      <w:proofErr w:type="gramEnd"/>
+      <w:r>
+        <w:t>",</w:t>
+      </w:r>
+    </w:p>
+    <w:p>
+      <w:r>
+        <w:t xml:space="preserve">    </w:t>
+      </w:r>
+      <w:proofErr w:type="spellStart"/>
+      <w:r>
+        <w:t>codigoProducto</w:t>
+      </w:r>
+      <w:proofErr w:type="spellEnd"/>
+      <w:r>
+        <w:t>: "$</w:t>
+      </w:r>
+      <w:proofErr w:type="spellStart"/>
+      <w:proofErr w:type="gramStart"/>
+      <w:r>
+        <w:t>items.producto</w:t>
+      </w:r>
+      <w:proofErr w:type="gramEnd"/>
+      <w:r>
+        <w:t>.codigo</w:t>
+      </w:r>
+      <w:proofErr w:type="spellEnd"/>
+      <w:r>
+        <w:t>",</w:t>
+      </w:r>
+    </w:p>
+    <w:p>
+      <w:r>
+        <w:t xml:space="preserve">    producto: "$</w:t>
+      </w:r>
+      <w:proofErr w:type="spellStart"/>
+      <w:proofErr w:type="gramStart"/>
+      <w:r>
+        <w:t>items.producto</w:t>
+      </w:r>
+      <w:proofErr w:type="gramEnd"/>
+      <w:r>
+        <w:t>.descripcion</w:t>
+      </w:r>
+      <w:proofErr w:type="spellEnd"/>
+      <w:r>
+        <w:t>"</w:t>
+      </w:r>
+    </w:p>
+    <w:p>
+      <w:r>
+        <w:t xml:space="preserve">   },</w:t>
+      </w:r>
+    </w:p>
+    <w:p>
+      <w:r>
+        <w:t xml:space="preserve">   </w:t>
+      </w:r>
+      <w:proofErr w:type="spellStart"/>
+      <w:r>
+        <w:t>cantidadVendida</w:t>
+      </w:r>
+      <w:proofErr w:type="spellEnd"/>
+      <w:r>
+        <w:t xml:space="preserve">: </w:t>
+      </w:r>
+      <w:proofErr w:type="gramStart"/>
+      <w:r>
+        <w:t>{ $</w:t>
+      </w:r>
+      <w:proofErr w:type="gramEnd"/>
+      <w:r>
+        <w:t>sum: "$</w:t>
+      </w:r>
+      <w:proofErr w:type="spellStart"/>
+      <w:proofErr w:type="gramStart"/>
+      <w:r>
+        <w:t>items.cantidad</w:t>
+      </w:r>
+      <w:proofErr w:type="spellEnd"/>
+      <w:r>
+        <w:t>" }</w:t>
+      </w:r>
+      <w:proofErr w:type="gramEnd"/>
+    </w:p>
+    <w:p>
+      <w:r>
+        <w:t xml:space="preserve">  }</w:t>
+      </w:r>
+    </w:p>
+    <w:p>
+      <w:r>
+        <w:t xml:space="preserve"> },</w:t>
+      </w:r>
+    </w:p>
+    <w:p>
+      <w:r>
+        <w:t xml:space="preserve"> </w:t>
+      </w:r>
+      <w:proofErr w:type="gramStart"/>
+      <w:r>
+        <w:t>{ $</w:t>
+      </w:r>
+      <w:proofErr w:type="spellStart"/>
+      <w:proofErr w:type="gramEnd"/>
+      <w:r>
+        <w:t>sort</w:t>
+      </w:r>
+      <w:proofErr w:type="spellEnd"/>
+      <w:r>
+        <w:t xml:space="preserve">: </w:t>
+      </w:r>
+      <w:proofErr w:type="gramStart"/>
+      <w:r>
+        <w:t xml:space="preserve">{ </w:t>
+      </w:r>
+      <w:proofErr w:type="spellStart"/>
+      <w:r>
+        <w:t>cantidadVendida</w:t>
+      </w:r>
+      <w:proofErr w:type="spellEnd"/>
+      <w:proofErr w:type="gramEnd"/>
+      <w:r>
+        <w:t>: -</w:t>
+      </w:r>
+      <w:proofErr w:type="gramStart"/>
+      <w:r>
+        <w:t>1 }</w:t>
+      </w:r>
+      <w:proofErr w:type="gramEnd"/>
+      <w:r>
+        <w:t xml:space="preserve"> },</w:t>
+      </w:r>
+    </w:p>
+    <w:p>
+      <w:r>
+        <w:t xml:space="preserve"> {</w:t>
+      </w:r>
+    </w:p>
+    <w:p>
+      <w:r>
+        <w:t xml:space="preserve">  $</w:t>
+      </w:r>
+      <w:proofErr w:type="spellStart"/>
+      <w:r>
+        <w:t>project</w:t>
+      </w:r>
+      <w:proofErr w:type="spellEnd"/>
+      <w:r>
+        <w:t>: {</w:t>
+      </w:r>
+    </w:p>
+    <w:p>
+      <w:r>
+        <w:t xml:space="preserve">   _id: 0,</w:t>
+      </w:r>
+    </w:p>
+    <w:p>
+      <w:r>
+        <w:t xml:space="preserve">   sucursal: "$_</w:t>
+      </w:r>
+      <w:proofErr w:type="spellStart"/>
+      <w:proofErr w:type="gramStart"/>
+      <w:r>
+        <w:t>id.sucursal</w:t>
+      </w:r>
+      <w:proofErr w:type="spellEnd"/>
+      <w:proofErr w:type="gramEnd"/>
+      <w:r>
+        <w:t>",</w:t>
+      </w:r>
+    </w:p>
+    <w:p>
+      <w:r>
+        <w:t xml:space="preserve">   </w:t>
+      </w:r>
+      <w:proofErr w:type="spellStart"/>
+      <w:r>
+        <w:t>codigoProducto</w:t>
+      </w:r>
+      <w:proofErr w:type="spellEnd"/>
+      <w:r>
+        <w:t>: "$_</w:t>
+      </w:r>
+      <w:proofErr w:type="spellStart"/>
+      <w:proofErr w:type="gramStart"/>
+      <w:r>
+        <w:t>id.codigoProducto</w:t>
+      </w:r>
+      <w:proofErr w:type="spellEnd"/>
+      <w:proofErr w:type="gramEnd"/>
+      <w:r>
+        <w:t>",</w:t>
+      </w:r>
+    </w:p>
+    <w:p>
+      <w:r>
+        <w:t xml:space="preserve">   producto: "$_</w:t>
+      </w:r>
+      <w:proofErr w:type="spellStart"/>
+      <w:proofErr w:type="gramStart"/>
+      <w:r>
+        <w:t>id.producto</w:t>
+      </w:r>
+      <w:proofErr w:type="spellEnd"/>
+      <w:proofErr w:type="gramEnd"/>
+      <w:r>
+        <w:t>",</w:t>
+      </w:r>
+    </w:p>
+    <w:p>
+      <w:r>
+        <w:t xml:space="preserve">   </w:t>
+      </w:r>
+      <w:proofErr w:type="spellStart"/>
+      <w:r>
+        <w:t>cantidadVendida</w:t>
+      </w:r>
+      <w:proofErr w:type="spellEnd"/>
+      <w:r>
+        <w:t>: 1</w:t>
+      </w:r>
+    </w:p>
+    <w:p>
+      <w:r>
+        <w:t xml:space="preserve">  }</w:t>
+      </w:r>
+    </w:p>
+    <w:p>
+      <w:r>
+        <w:t xml:space="preserve"> }</w:t>
+      </w:r>
+    </w:p>
+    <w:p>
+      <w:r>
+        <w:t>]</w:t>
+      </w:r>
+    </w:p>
+    <w:p/>
+    <w:p>
+      <w:r>
+        <w:rPr>
+          <w:noProof/>
+        </w:rPr>
+        <w:drawing>
+          <wp:inline distT="0" distB="0" distL="0" distR="0" wp14:anchorId="2CFB028F" wp14:editId="349DEB29">
+            <wp:extent cx="5303520" cy="2882235"/>
+            <wp:effectExtent l="0" t="0" r="0" b="0"/>
+            <wp:docPr id="5" name="Picture 5"/>
+            <wp:cNvGraphicFramePr>
+              <a:graphicFrameLocks xmlns:a="http://schemas.openxmlformats.org/drawingml/2006/main" noChangeAspect="1"/>
+            </wp:cNvGraphicFramePr>
+            <a:graphic xmlns:a="http://schemas.openxmlformats.org/drawingml/2006/main">
+              <a:graphicData uri="http://schemas.openxmlformats.org/drawingml/2006/picture">
+                <pic:pic xmlns:pic="http://schemas.openxmlformats.org/drawingml/2006/picture">
+                  <pic:nvPicPr>
+                    <pic:cNvPr id="0" name="image(124).png"/>
+                    <pic:cNvPicPr/>
+                  </pic:nvPicPr>
+                  <pic:blipFill>
+                    <a:blip r:embed="rId8"/>
+                    <a:stretch>
+                      <a:fillRect/>
+                    </a:stretch>
+                  </pic:blipFill>
+                  <pic:spPr>
+                    <a:xfrm>
+                      <a:off x="0" y="0"/>
+                      <a:ext cx="5303520" cy="2882235"/>
+                    </a:xfrm>
+                    <a:prstGeom prst="rect">
+                      <a:avLst/>
+                    </a:prstGeom>
+                  </pic:spPr>
+                </pic:pic>
+              </a:graphicData>
+            </a:graphic>
+          </wp:inline>
+        </w:drawing>
+      </w:r>
+    </w:p>
     <w:sectPr>
       <w:pgSz w:w="11906" w:h="16838"/>
       <w:pgMar w:top="1417" w:right="1701" w:bottom="1417" w:left="1701" w:header="708" w:footer="708" w:gutter="0"/>
@@ -2240,7 +4040,7 @@
 </file>
 
 <file path=word/styles.xml><?xml version="1.0" encoding="utf-8"?>
-<w:styles xmlns:mc="http://schemas.openxmlformats.org/markup-compatibility/2006" xmlns:r="http://schemas.openxmlformats.org/officeDocument/2006/relationships" xmlns:w="http://schemas.openxmlformats.org/wordprocessingml/2006/main" xmlns:w14="http://schemas.microsoft.com/office/word/2010/wordml" mc:Ignorable="w14">
+<w:styles xmlns:mc="http://schemas.openxmlformats.org/markup-compatibility/2006" xmlns:r="http://schemas.openxmlformats.org/officeDocument/2006/relationships" xmlns:w="http://schemas.openxmlformats.org/wordprocessingml/2006/main" xmlns:w14="http://schemas.microsoft.com/office/word/2010/wordml" xmlns:w15="http://schemas.microsoft.com/office/word/2012/wordml" xmlns:w16cex="http://schemas.microsoft.com/office/word/2018/wordml/cex" xmlns:w16cid="http://schemas.microsoft.com/office/word/2016/wordml/cid" xmlns:w16="http://schemas.microsoft.com/office/word/2018/wordml" xmlns:w16du="http://schemas.microsoft.com/office/word/2023/wordml/word16du" xmlns:w16sdtdh="http://schemas.microsoft.com/office/word/2020/wordml/sdtdatahash" xmlns:w16sdtfl="http://schemas.microsoft.com/office/word/2024/wordml/sdtformatlock" xmlns:w16se="http://schemas.microsoft.com/office/word/2015/wordml/symex" mc:Ignorable="w14 w15 w16se w16cid w16 w16cex w16sdtdh w16sdtfl w16du">
   <w:docDefaults>
     <w:rPrDefault>
       <w:rPr>
@@ -2256,156 +4056,395 @@
       </w:pPr>
     </w:pPrDefault>
   </w:docDefaults>
-  <w:latentStyles w:defLockedState="0" w:defUIPriority="99" w:defSemiHidden="1" w:defUnhideWhenUsed="1" w:defQFormat="0" w:count="267">
-    <w:lsdException w:name="Normal" w:semiHidden="0" w:uiPriority="0" w:unhideWhenUsed="0" w:qFormat="1"/>
-    <w:lsdException w:name="heading 1" w:semiHidden="0" w:uiPriority="9" w:unhideWhenUsed="0" w:qFormat="1"/>
-    <w:lsdException w:name="heading 2" w:uiPriority="9" w:qFormat="1"/>
-    <w:lsdException w:name="heading 3" w:uiPriority="9" w:qFormat="1"/>
-    <w:lsdException w:name="heading 4" w:uiPriority="9" w:qFormat="1"/>
-    <w:lsdException w:name="heading 5" w:uiPriority="9" w:qFormat="1"/>
-    <w:lsdException w:name="heading 6" w:uiPriority="9" w:qFormat="1"/>
-    <w:lsdException w:name="heading 7" w:uiPriority="9" w:qFormat="1"/>
-    <w:lsdException w:name="heading 8" w:uiPriority="9" w:qFormat="1"/>
-    <w:lsdException w:name="heading 9" w:uiPriority="9" w:qFormat="1"/>
-    <w:lsdException w:name="toc 1" w:uiPriority="39"/>
-    <w:lsdException w:name="toc 2" w:uiPriority="39"/>
-    <w:lsdException w:name="toc 3" w:uiPriority="39"/>
-    <w:lsdException w:name="toc 4" w:uiPriority="39"/>
-    <w:lsdException w:name="toc 5" w:uiPriority="39"/>
-    <w:lsdException w:name="toc 6" w:uiPriority="39"/>
-    <w:lsdException w:name="toc 7" w:uiPriority="39"/>
-    <w:lsdException w:name="toc 8" w:uiPriority="39"/>
-    <w:lsdException w:name="toc 9" w:uiPriority="39"/>
-    <w:lsdException w:name="caption" w:uiPriority="35" w:qFormat="1"/>
-    <w:lsdException w:name="Title" w:semiHidden="0" w:uiPriority="10" w:unhideWhenUsed="0" w:qFormat="1"/>
-    <w:lsdException w:name="Default Paragraph Font" w:uiPriority="1"/>
-    <w:lsdException w:name="Subtitle" w:semiHidden="0" w:uiPriority="11" w:unhideWhenUsed="0" w:qFormat="1"/>
-    <w:lsdException w:name="Strong" w:semiHidden="0" w:uiPriority="22" w:unhideWhenUsed="0" w:qFormat="1"/>
-    <w:lsdException w:name="Emphasis" w:semiHidden="0" w:uiPriority="20" w:unhideWhenUsed="0" w:qFormat="1"/>
-    <w:lsdException w:name="Table Grid" w:semiHidden="0" w:uiPriority="39" w:unhideWhenUsed="0"/>
-    <w:lsdException w:name="Placeholder Text" w:unhideWhenUsed="0"/>
-    <w:lsdException w:name="No Spacing" w:semiHidden="0" w:uiPriority="1" w:unhideWhenUsed="0" w:qFormat="1"/>
-    <w:lsdException w:name="Light Shading" w:semiHidden="0" w:uiPriority="60" w:unhideWhenUsed="0"/>
-    <w:lsdException w:name="Light List" w:semiHidden="0" w:uiPriority="61" w:unhideWhenUsed="0"/>
-    <w:lsdException w:name="Light Grid" w:semiHidden="0" w:uiPriority="62" w:unhideWhenUsed="0"/>
-    <w:lsdException w:name="Medium Shading 1" w:semiHidden="0" w:uiPriority="63" w:unhideWhenUsed="0"/>
-    <w:lsdException w:name="Medium Shading 2" w:semiHidden="0" w:uiPriority="64" w:unhideWhenUsed="0"/>
-    <w:lsdException w:name="Medium List 1" w:semiHidden="0" w:uiPriority="65" w:unhideWhenUsed="0"/>
-    <w:lsdException w:name="Medium List 2" w:semiHidden="0" w:uiPriority="66" w:unhideWhenUsed="0"/>
-    <w:lsdException w:name="Medium Grid 1" w:semiHidden="0" w:uiPriority="67" w:unhideWhenUsed="0"/>
-    <w:lsdException w:name="Medium Grid 2" w:semiHidden="0" w:uiPriority="68" w:unhideWhenUsed="0"/>
-    <w:lsdException w:name="Medium Grid 3" w:semiHidden="0" w:uiPriority="69" w:unhideWhenUsed="0"/>
-    <w:lsdException w:name="Dark List" w:semiHidden="0" w:uiPriority="70" w:unhideWhenUsed="0"/>
-    <w:lsdException w:name="Colorful Shading" w:semiHidden="0" w:uiPriority="71" w:unhideWhenUsed="0"/>
-    <w:lsdException w:name="Colorful List" w:semiHidden="0" w:uiPriority="72" w:unhideWhenUsed="0"/>
-    <w:lsdException w:name="Colorful Grid" w:semiHidden="0" w:uiPriority="73" w:unhideWhenUsed="0"/>
-    <w:lsdException w:name="Light Shading Accent 1" w:semiHidden="0" w:uiPriority="60" w:unhideWhenUsed="0"/>
-    <w:lsdException w:name="Light List Accent 1" w:semiHidden="0" w:uiPriority="61" w:unhideWhenUsed="0"/>
-    <w:lsdException w:name="Light Grid Accent 1" w:semiHidden="0" w:uiPriority="62" w:unhideWhenUsed="0"/>
-    <w:lsdException w:name="Medium Shading 1 Accent 1" w:semiHidden="0" w:uiPriority="63" w:unhideWhenUsed="0"/>
-    <w:lsdException w:name="Medium Shading 2 Accent 1" w:semiHidden="0" w:uiPriority="64" w:unhideWhenUsed="0"/>
-    <w:lsdException w:name="Medium List 1 Accent 1" w:semiHidden="0" w:uiPriority="65" w:unhideWhenUsed="0"/>
-    <w:lsdException w:name="Revision" w:unhideWhenUsed="0"/>
-    <w:lsdException w:name="List Paragraph" w:semiHidden="0" w:uiPriority="34" w:unhideWhenUsed="0" w:qFormat="1"/>
-    <w:lsdException w:name="Quote" w:semiHidden="0" w:uiPriority="29" w:unhideWhenUsed="0" w:qFormat="1"/>
-    <w:lsdException w:name="Intense Quote" w:semiHidden="0" w:uiPriority="30" w:unhideWhenUsed="0" w:qFormat="1"/>
-    <w:lsdException w:name="Medium List 2 Accent 1" w:semiHidden="0" w:uiPriority="66" w:unhideWhenUsed="0"/>
-    <w:lsdException w:name="Medium Grid 1 Accent 1" w:semiHidden="0" w:uiPriority="67" w:unhideWhenUsed="0"/>
-    <w:lsdException w:name="Medium Grid 2 Accent 1" w:semiHidden="0" w:uiPriority="68" w:unhideWhenUsed="0"/>
-    <w:lsdException w:name="Medium Grid 3 Accent 1" w:semiHidden="0" w:uiPriority="69" w:unhideWhenUsed="0"/>
-    <w:lsdException w:name="Dark List Accent 1" w:semiHidden="0" w:uiPriority="70" w:unhideWhenUsed="0"/>
-    <w:lsdException w:name="Colorful Shading Accent 1" w:semiHidden="0" w:uiPriority="71" w:unhideWhenUsed="0"/>
-    <w:lsdException w:name="Colorful List Accent 1" w:semiHidden="0" w:uiPriority="72" w:unhideWhenUsed="0"/>
-    <w:lsdException w:name="Colorful Grid Accent 1" w:semiHidden="0" w:uiPriority="73" w:unhideWhenUsed="0"/>
-    <w:lsdException w:name="Light Shading Accent 2" w:semiHidden="0" w:uiPriority="60" w:unhideWhenUsed="0"/>
-    <w:lsdException w:name="Light List Accent 2" w:semiHidden="0" w:uiPriority="61" w:unhideWhenUsed="0"/>
-    <w:lsdException w:name="Light Grid Accent 2" w:semiHidden="0" w:uiPriority="62" w:unhideWhenUsed="0"/>
-    <w:lsdException w:name="Medium Shading 1 Accent 2" w:semiHidden="0" w:uiPriority="63" w:unhideWhenUsed="0"/>
-    <w:lsdException w:name="Medium Shading 2 Accent 2" w:semiHidden="0" w:uiPriority="64" w:unhideWhenUsed="0"/>
-    <w:lsdException w:name="Medium List 1 Accent 2" w:semiHidden="0" w:uiPriority="65" w:unhideWhenUsed="0"/>
-    <w:lsdException w:name="Medium List 2 Accent 2" w:semiHidden="0" w:uiPriority="66" w:unhideWhenUsed="0"/>
-    <w:lsdException w:name="Medium Grid 1 Accent 2" w:semiHidden="0" w:uiPriority="67" w:unhideWhenUsed="0"/>
-    <w:lsdException w:name="Medium Grid 2 Accent 2" w:semiHidden="0" w:uiPriority="68" w:unhideWhenUsed="0"/>
-    <w:lsdException w:name="Medium Grid 3 Accent 2" w:semiHidden="0" w:uiPriority="69" w:unhideWhenUsed="0"/>
-    <w:lsdException w:name="Dark List Accent 2" w:semiHidden="0" w:uiPriority="70" w:unhideWhenUsed="0"/>
-    <w:lsdException w:name="Colorful Shading Accent 2" w:semiHidden="0" w:uiPriority="71" w:unhideWhenUsed="0"/>
-    <w:lsdException w:name="Colorful List Accent 2" w:semiHidden="0" w:uiPriority="72" w:unhideWhenUsed="0"/>
-    <w:lsdException w:name="Colorful Grid Accent 2" w:semiHidden="0" w:uiPriority="73" w:unhideWhenUsed="0"/>
-    <w:lsdException w:name="Light Shading Accent 3" w:semiHidden="0" w:uiPriority="60" w:unhideWhenUsed="0"/>
-    <w:lsdException w:name="Light List Accent 3" w:semiHidden="0" w:uiPriority="61" w:unhideWhenUsed="0"/>
-    <w:lsdException w:name="Light Grid Accent 3" w:semiHidden="0" w:uiPriority="62" w:unhideWhenUsed="0"/>
-    <w:lsdException w:name="Medium Shading 1 Accent 3" w:semiHidden="0" w:uiPriority="63" w:unhideWhenUsed="0"/>
-    <w:lsdException w:name="Medium Shading 2 Accent 3" w:semiHidden="0" w:uiPriority="64" w:unhideWhenUsed="0"/>
-    <w:lsdException w:name="Medium List 1 Accent 3" w:semiHidden="0" w:uiPriority="65" w:unhideWhenUsed="0"/>
-    <w:lsdException w:name="Medium List 2 Accent 3" w:semiHidden="0" w:uiPriority="66" w:unhideWhenUsed="0"/>
-    <w:lsdException w:name="Medium Grid 1 Accent 3" w:semiHidden="0" w:uiPriority="67" w:unhideWhenUsed="0"/>
-    <w:lsdException w:name="Medium Grid 2 Accent 3" w:semiHidden="0" w:uiPriority="68" w:unhideWhenUsed="0"/>
-    <w:lsdException w:name="Medium Grid 3 Accent 3" w:semiHidden="0" w:uiPriority="69" w:unhideWhenUsed="0"/>
-    <w:lsdException w:name="Dark List Accent 3" w:semiHidden="0" w:uiPriority="70" w:unhideWhenUsed="0"/>
-    <w:lsdException w:name="Colorful Shading Accent 3" w:semiHidden="0" w:uiPriority="71" w:unhideWhenUsed="0"/>
-    <w:lsdException w:name="Colorful List Accent 3" w:semiHidden="0" w:uiPriority="72" w:unhideWhenUsed="0"/>
-    <w:lsdException w:name="Colorful Grid Accent 3" w:semiHidden="0" w:uiPriority="73" w:unhideWhenUsed="0"/>
-    <w:lsdException w:name="Light Shading Accent 4" w:semiHidden="0" w:uiPriority="60" w:unhideWhenUsed="0"/>
-    <w:lsdException w:name="Light List Accent 4" w:semiHidden="0" w:uiPriority="61" w:unhideWhenUsed="0"/>
-    <w:lsdException w:name="Light Grid Accent 4" w:semiHidden="0" w:uiPriority="62" w:unhideWhenUsed="0"/>
-    <w:lsdException w:name="Medium Shading 1 Accent 4" w:semiHidden="0" w:uiPriority="63" w:unhideWhenUsed="0"/>
-    <w:lsdException w:name="Medium Shading 2 Accent 4" w:semiHidden="0" w:uiPriority="64" w:unhideWhenUsed="0"/>
-    <w:lsdException w:name="Medium List 1 Accent 4" w:semiHidden="0" w:uiPriority="65" w:unhideWhenUsed="0"/>
-    <w:lsdException w:name="Medium List 2 Accent 4" w:semiHidden="0" w:uiPriority="66" w:unhideWhenUsed="0"/>
-    <w:lsdException w:name="Medium Grid 1 Accent 4" w:semiHidden="0" w:uiPriority="67" w:unhideWhenUsed="0"/>
-    <w:lsdException w:name="Medium Grid 2 Accent 4" w:semiHidden="0" w:uiPriority="68" w:unhideWhenUsed="0"/>
-    <w:lsdException w:name="Medium Grid 3 Accent 4" w:semiHidden="0" w:uiPriority="69" w:unhideWhenUsed="0"/>
-    <w:lsdException w:name="Dark List Accent 4" w:semiHidden="0" w:uiPriority="70" w:unhideWhenUsed="0"/>
-    <w:lsdException w:name="Colorful Shading Accent 4" w:semiHidden="0" w:uiPriority="71" w:unhideWhenUsed="0"/>
-    <w:lsdException w:name="Colorful List Accent 4" w:semiHidden="0" w:uiPriority="72" w:unhideWhenUsed="0"/>
-    <w:lsdException w:name="Colorful Grid Accent 4" w:semiHidden="0" w:uiPriority="73" w:unhideWhenUsed="0"/>
-    <w:lsdException w:name="Light Shading Accent 5" w:semiHidden="0" w:uiPriority="60" w:unhideWhenUsed="0"/>
-    <w:lsdException w:name="Light List Accent 5" w:semiHidden="0" w:uiPriority="61" w:unhideWhenUsed="0"/>
-    <w:lsdException w:name="Light Grid Accent 5" w:semiHidden="0" w:uiPriority="62" w:unhideWhenUsed="0"/>
-    <w:lsdException w:name="Medium Shading 1 Accent 5" w:semiHidden="0" w:uiPriority="63" w:unhideWhenUsed="0"/>
-    <w:lsdException w:name="Medium Shading 2 Accent 5" w:semiHidden="0" w:uiPriority="64" w:unhideWhenUsed="0"/>
-    <w:lsdException w:name="Medium List 1 Accent 5" w:semiHidden="0" w:uiPriority="65" w:unhideWhenUsed="0"/>
-    <w:lsdException w:name="Medium List 2 Accent 5" w:semiHidden="0" w:uiPriority="66" w:unhideWhenUsed="0"/>
-    <w:lsdException w:name="Medium Grid 1 Accent 5" w:semiHidden="0" w:uiPriority="67" w:unhideWhenUsed="0"/>
-    <w:lsdException w:name="Medium Grid 2 Accent 5" w:semiHidden="0" w:uiPriority="68" w:unhideWhenUsed="0"/>
-    <w:lsdException w:name="Medium Grid 3 Accent 5" w:semiHidden="0" w:uiPriority="69" w:unhideWhenUsed="0"/>
-    <w:lsdException w:name="Dark List Accent 5" w:semiHidden="0" w:uiPriority="70" w:unhideWhenUsed="0"/>
-    <w:lsdException w:name="Colorful Shading Accent 5" w:semiHidden="0" w:uiPriority="71" w:unhideWhenUsed="0"/>
-    <w:lsdException w:name="Colorful List Accent 5" w:semiHidden="0" w:uiPriority="72" w:unhideWhenUsed="0"/>
-    <w:lsdException w:name="Colorful Grid Accent 5" w:semiHidden="0" w:uiPriority="73" w:unhideWhenUsed="0"/>
-    <w:lsdException w:name="Light Shading Accent 6" w:semiHidden="0" w:uiPriority="60" w:unhideWhenUsed="0"/>
-    <w:lsdException w:name="Light List Accent 6" w:semiHidden="0" w:uiPriority="61" w:unhideWhenUsed="0"/>
-    <w:lsdException w:name="Light Grid Accent 6" w:semiHidden="0" w:uiPriority="62" w:unhideWhenUsed="0"/>
-    <w:lsdException w:name="Medium Shading 1 Accent 6" w:semiHidden="0" w:uiPriority="63" w:unhideWhenUsed="0"/>
-    <w:lsdException w:name="Medium Shading 2 Accent 6" w:semiHidden="0" w:uiPriority="64" w:unhideWhenUsed="0"/>
-    <w:lsdException w:name="Medium List 1 Accent 6" w:semiHidden="0" w:uiPriority="65" w:unhideWhenUsed="0"/>
-    <w:lsdException w:name="Medium List 2 Accent 6" w:semiHidden="0" w:uiPriority="66" w:unhideWhenUsed="0"/>
-    <w:lsdException w:name="Medium Grid 1 Accent 6" w:semiHidden="0" w:uiPriority="67" w:unhideWhenUsed="0"/>
-    <w:lsdException w:name="Medium Grid 2 Accent 6" w:semiHidden="0" w:uiPriority="68" w:unhideWhenUsed="0"/>
-    <w:lsdException w:name="Medium Grid 3 Accent 6" w:semiHidden="0" w:uiPriority="69" w:unhideWhenUsed="0"/>
-    <w:lsdException w:name="Dark List Accent 6" w:semiHidden="0" w:uiPriority="70" w:unhideWhenUsed="0"/>
-    <w:lsdException w:name="Colorful Shading Accent 6" w:semiHidden="0" w:uiPriority="71" w:unhideWhenUsed="0"/>
-    <w:lsdException w:name="Colorful List Accent 6" w:semiHidden="0" w:uiPriority="72" w:unhideWhenUsed="0"/>
-    <w:lsdException w:name="Colorful Grid Accent 6" w:semiHidden="0" w:uiPriority="73" w:unhideWhenUsed="0"/>
-    <w:lsdException w:name="Subtle Emphasis" w:semiHidden="0" w:uiPriority="19" w:unhideWhenUsed="0" w:qFormat="1"/>
-    <w:lsdException w:name="Intense Emphasis" w:semiHidden="0" w:uiPriority="21" w:unhideWhenUsed="0" w:qFormat="1"/>
-    <w:lsdException w:name="Subtle Reference" w:semiHidden="0" w:uiPriority="31" w:unhideWhenUsed="0" w:qFormat="1"/>
-    <w:lsdException w:name="Intense Reference" w:semiHidden="0" w:uiPriority="32" w:unhideWhenUsed="0" w:qFormat="1"/>
-    <w:lsdException w:name="Book Title" w:semiHidden="0" w:uiPriority="33" w:unhideWhenUsed="0" w:qFormat="1"/>
-    <w:lsdException w:name="Bibliography" w:uiPriority="37"/>
-    <w:lsdException w:name="TOC Heading" w:uiPriority="39" w:qFormat="1"/>
+  <w:latentStyles w:defLockedState="0" w:defUIPriority="99" w:defSemiHidden="0" w:defUnhideWhenUsed="0" w:defQFormat="0" w:count="376">
+    <w:lsdException w:name="Normal" w:uiPriority="0" w:qFormat="1"/>
+    <w:lsdException w:name="heading 1" w:uiPriority="9" w:qFormat="1"/>
+    <w:lsdException w:name="heading 2" w:semiHidden="1" w:uiPriority="9" w:unhideWhenUsed="1" w:qFormat="1"/>
+    <w:lsdException w:name="heading 3" w:semiHidden="1" w:uiPriority="9" w:unhideWhenUsed="1" w:qFormat="1"/>
+    <w:lsdException w:name="heading 4" w:semiHidden="1" w:uiPriority="9" w:unhideWhenUsed="1" w:qFormat="1"/>
+    <w:lsdException w:name="heading 5" w:semiHidden="1" w:uiPriority="9" w:unhideWhenUsed="1" w:qFormat="1"/>
+    <w:lsdException w:name="heading 6" w:semiHidden="1" w:uiPriority="9" w:unhideWhenUsed="1" w:qFormat="1"/>
+    <w:lsdException w:name="heading 7" w:semiHidden="1" w:uiPriority="9" w:unhideWhenUsed="1" w:qFormat="1"/>
+    <w:lsdException w:name="heading 8" w:semiHidden="1" w:uiPriority="9" w:unhideWhenUsed="1" w:qFormat="1"/>
+    <w:lsdException w:name="heading 9" w:semiHidden="1" w:uiPriority="9" w:unhideWhenUsed="1" w:qFormat="1"/>
+    <w:lsdException w:name="index 1" w:semiHidden="1" w:unhideWhenUsed="1"/>
+    <w:lsdException w:name="index 2" w:semiHidden="1" w:unhideWhenUsed="1"/>
+    <w:lsdException w:name="index 3" w:semiHidden="1" w:unhideWhenUsed="1"/>
+    <w:lsdException w:name="index 4" w:semiHidden="1" w:unhideWhenUsed="1"/>
+    <w:lsdException w:name="index 5" w:semiHidden="1" w:unhideWhenUsed="1"/>
+    <w:lsdException w:name="index 6" w:semiHidden="1" w:unhideWhenUsed="1"/>
+    <w:lsdException w:name="index 7" w:semiHidden="1" w:unhideWhenUsed="1"/>
+    <w:lsdException w:name="index 8" w:semiHidden="1" w:unhideWhenUsed="1"/>
+    <w:lsdException w:name="index 9" w:semiHidden="1" w:unhideWhenUsed="1"/>
+    <w:lsdException w:name="toc 1" w:semiHidden="1" w:uiPriority="39" w:unhideWhenUsed="1"/>
+    <w:lsdException w:name="toc 2" w:semiHidden="1" w:uiPriority="39" w:unhideWhenUsed="1"/>
+    <w:lsdException w:name="toc 3" w:semiHidden="1" w:uiPriority="39" w:unhideWhenUsed="1"/>
+    <w:lsdException w:name="toc 4" w:semiHidden="1" w:uiPriority="39" w:unhideWhenUsed="1"/>
+    <w:lsdException w:name="toc 5" w:semiHidden="1" w:uiPriority="39" w:unhideWhenUsed="1"/>
+    <w:lsdException w:name="toc 6" w:semiHidden="1" w:uiPriority="39" w:unhideWhenUsed="1"/>
+    <w:lsdException w:name="toc 7" w:semiHidden="1" w:uiPriority="39" w:unhideWhenUsed="1"/>
+    <w:lsdException w:name="toc 8" w:semiHidden="1" w:uiPriority="39" w:unhideWhenUsed="1"/>
+    <w:lsdException w:name="toc 9" w:semiHidden="1" w:uiPriority="39" w:unhideWhenUsed="1"/>
+    <w:lsdException w:name="Normal Indent" w:semiHidden="1" w:unhideWhenUsed="1"/>
+    <w:lsdException w:name="footnote text" w:semiHidden="1" w:unhideWhenUsed="1"/>
+    <w:lsdException w:name="annotation text" w:semiHidden="1" w:unhideWhenUsed="1"/>
+    <w:lsdException w:name="header" w:semiHidden="1" w:unhideWhenUsed="1"/>
+    <w:lsdException w:name="footer" w:semiHidden="1" w:unhideWhenUsed="1"/>
+    <w:lsdException w:name="index heading" w:semiHidden="1" w:unhideWhenUsed="1"/>
+    <w:lsdException w:name="caption" w:semiHidden="1" w:uiPriority="35" w:unhideWhenUsed="1" w:qFormat="1"/>
+    <w:lsdException w:name="table of figures" w:semiHidden="1" w:unhideWhenUsed="1"/>
+    <w:lsdException w:name="envelope address" w:semiHidden="1" w:unhideWhenUsed="1"/>
+    <w:lsdException w:name="envelope return" w:semiHidden="1" w:unhideWhenUsed="1"/>
+    <w:lsdException w:name="footnote reference" w:semiHidden="1" w:unhideWhenUsed="1"/>
+    <w:lsdException w:name="annotation reference" w:semiHidden="1" w:unhideWhenUsed="1"/>
+    <w:lsdException w:name="line number" w:semiHidden="1" w:unhideWhenUsed="1"/>
+    <w:lsdException w:name="page number" w:semiHidden="1" w:unhideWhenUsed="1"/>
+    <w:lsdException w:name="endnote reference" w:semiHidden="1" w:unhideWhenUsed="1"/>
+    <w:lsdException w:name="endnote text" w:semiHidden="1" w:unhideWhenUsed="1"/>
+    <w:lsdException w:name="table of authorities" w:semiHidden="1" w:unhideWhenUsed="1"/>
+    <w:lsdException w:name="macro" w:semiHidden="1" w:unhideWhenUsed="1"/>
+    <w:lsdException w:name="toa heading" w:semiHidden="1" w:unhideWhenUsed="1"/>
+    <w:lsdException w:name="List" w:semiHidden="1" w:unhideWhenUsed="1"/>
+    <w:lsdException w:name="List Bullet" w:semiHidden="1" w:unhideWhenUsed="1"/>
+    <w:lsdException w:name="List Number" w:semiHidden="1" w:unhideWhenUsed="1"/>
+    <w:lsdException w:name="List 2" w:semiHidden="1" w:unhideWhenUsed="1"/>
+    <w:lsdException w:name="List 3" w:semiHidden="1" w:unhideWhenUsed="1"/>
+    <w:lsdException w:name="List 4" w:semiHidden="1" w:unhideWhenUsed="1"/>
+    <w:lsdException w:name="List 5" w:semiHidden="1" w:unhideWhenUsed="1"/>
+    <w:lsdException w:name="List Bullet 2" w:semiHidden="1" w:unhideWhenUsed="1"/>
+    <w:lsdException w:name="List Bullet 3" w:semiHidden="1" w:unhideWhenUsed="1"/>
+    <w:lsdException w:name="List Bullet 4" w:semiHidden="1" w:unhideWhenUsed="1"/>
+    <w:lsdException w:name="List Bullet 5" w:semiHidden="1" w:unhideWhenUsed="1"/>
+    <w:lsdException w:name="List Number 2" w:semiHidden="1" w:unhideWhenUsed="1"/>
+    <w:lsdException w:name="List Number 3" w:semiHidden="1" w:unhideWhenUsed="1"/>
+    <w:lsdException w:name="List Number 4" w:semiHidden="1" w:unhideWhenUsed="1"/>
+    <w:lsdException w:name="List Number 5" w:semiHidden="1" w:unhideWhenUsed="1"/>
+    <w:lsdException w:name="Title" w:uiPriority="10" w:qFormat="1"/>
+    <w:lsdException w:name="Closing" w:semiHidden="1" w:unhideWhenUsed="1"/>
+    <w:lsdException w:name="Signature" w:semiHidden="1" w:unhideWhenUsed="1"/>
+    <w:lsdException w:name="Default Paragraph Font" w:semiHidden="1" w:uiPriority="1" w:unhideWhenUsed="1"/>
+    <w:lsdException w:name="Body Text" w:semiHidden="1" w:unhideWhenUsed="1"/>
+    <w:lsdException w:name="Body Text Indent" w:semiHidden="1" w:unhideWhenUsed="1"/>
+    <w:lsdException w:name="List Continue" w:semiHidden="1" w:unhideWhenUsed="1"/>
+    <w:lsdException w:name="List Continue 2" w:semiHidden="1" w:unhideWhenUsed="1"/>
+    <w:lsdException w:name="List Continue 3" w:semiHidden="1" w:unhideWhenUsed="1"/>
+    <w:lsdException w:name="List Continue 4" w:semiHidden="1" w:unhideWhenUsed="1"/>
+    <w:lsdException w:name="List Continue 5" w:semiHidden="1" w:unhideWhenUsed="1"/>
+    <w:lsdException w:name="Message Header" w:semiHidden="1" w:unhideWhenUsed="1"/>
+    <w:lsdException w:name="Subtitle" w:uiPriority="11" w:qFormat="1"/>
+    <w:lsdException w:name="Salutation" w:semiHidden="1" w:unhideWhenUsed="1"/>
+    <w:lsdException w:name="Date" w:semiHidden="1" w:unhideWhenUsed="1"/>
+    <w:lsdException w:name="Body Text First Indent" w:semiHidden="1" w:unhideWhenUsed="1"/>
+    <w:lsdException w:name="Body Text First Indent 2" w:semiHidden="1" w:unhideWhenUsed="1"/>
+    <w:lsdException w:name="Note Heading" w:semiHidden="1" w:unhideWhenUsed="1"/>
+    <w:lsdException w:name="Body Text 2" w:semiHidden="1" w:unhideWhenUsed="1"/>
+    <w:lsdException w:name="Body Text 3" w:semiHidden="1" w:unhideWhenUsed="1"/>
+    <w:lsdException w:name="Body Text Indent 2" w:semiHidden="1" w:unhideWhenUsed="1"/>
+    <w:lsdException w:name="Body Text Indent 3" w:semiHidden="1" w:unhideWhenUsed="1"/>
+    <w:lsdException w:name="Block Text" w:semiHidden="1" w:unhideWhenUsed="1"/>
+    <w:lsdException w:name="Hyperlink" w:semiHidden="1" w:unhideWhenUsed="1"/>
+    <w:lsdException w:name="FollowedHyperlink" w:semiHidden="1" w:unhideWhenUsed="1"/>
+    <w:lsdException w:name="Strong" w:uiPriority="22" w:qFormat="1"/>
+    <w:lsdException w:name="Emphasis" w:uiPriority="20" w:qFormat="1"/>
+    <w:lsdException w:name="Document Map" w:semiHidden="1" w:unhideWhenUsed="1"/>
+    <w:lsdException w:name="Plain Text" w:semiHidden="1" w:unhideWhenUsed="1"/>
+    <w:lsdException w:name="E-mail Signature" w:semiHidden="1" w:unhideWhenUsed="1"/>
+    <w:lsdException w:name="HTML Top of Form" w:semiHidden="1" w:unhideWhenUsed="1"/>
+    <w:lsdException w:name="HTML Bottom of Form" w:semiHidden="1" w:unhideWhenUsed="1"/>
+    <w:lsdException w:name="Normal (Web)" w:semiHidden="1" w:unhideWhenUsed="1"/>
+    <w:lsdException w:name="HTML Acronym" w:semiHidden="1" w:unhideWhenUsed="1"/>
+    <w:lsdException w:name="HTML Address" w:semiHidden="1" w:unhideWhenUsed="1"/>
+    <w:lsdException w:name="HTML Cite" w:semiHidden="1" w:unhideWhenUsed="1"/>
+    <w:lsdException w:name="HTML Code" w:semiHidden="1" w:unhideWhenUsed="1"/>
+    <w:lsdException w:name="HTML Definition" w:semiHidden="1" w:unhideWhenUsed="1"/>
+    <w:lsdException w:name="HTML Keyboard" w:semiHidden="1" w:unhideWhenUsed="1"/>
+    <w:lsdException w:name="HTML Preformatted" w:semiHidden="1" w:unhideWhenUsed="1"/>
+    <w:lsdException w:name="HTML Sample" w:semiHidden="1" w:unhideWhenUsed="1"/>
+    <w:lsdException w:name="HTML Typewriter" w:semiHidden="1" w:unhideWhenUsed="1"/>
+    <w:lsdException w:name="HTML Variable" w:semiHidden="1" w:unhideWhenUsed="1"/>
+    <w:lsdException w:name="Normal Table" w:semiHidden="1" w:unhideWhenUsed="1"/>
+    <w:lsdException w:name="annotation subject" w:semiHidden="1" w:unhideWhenUsed="1"/>
+    <w:lsdException w:name="No List" w:semiHidden="1" w:unhideWhenUsed="1"/>
+    <w:lsdException w:name="Outline List 1" w:semiHidden="1" w:unhideWhenUsed="1"/>
+    <w:lsdException w:name="Outline List 2" w:semiHidden="1" w:unhideWhenUsed="1"/>
+    <w:lsdException w:name="Outline List 3" w:semiHidden="1" w:unhideWhenUsed="1"/>
+    <w:lsdException w:name="Table Simple 1" w:semiHidden="1" w:unhideWhenUsed="1"/>
+    <w:lsdException w:name="Table Simple 2" w:semiHidden="1" w:unhideWhenUsed="1"/>
+    <w:lsdException w:name="Table Simple 3" w:semiHidden="1" w:unhideWhenUsed="1"/>
+    <w:lsdException w:name="Table Classic 1" w:semiHidden="1" w:unhideWhenUsed="1"/>
+    <w:lsdException w:name="Table Classic 2" w:semiHidden="1" w:unhideWhenUsed="1"/>
+    <w:lsdException w:name="Table Classic 3" w:semiHidden="1" w:unhideWhenUsed="1"/>
+    <w:lsdException w:name="Table Classic 4" w:semiHidden="1" w:unhideWhenUsed="1"/>
+    <w:lsdException w:name="Table Colorful 1" w:semiHidden="1" w:unhideWhenUsed="1"/>
+    <w:lsdException w:name="Table Colorful 2" w:semiHidden="1" w:unhideWhenUsed="1"/>
+    <w:lsdException w:name="Table Colorful 3" w:semiHidden="1" w:unhideWhenUsed="1"/>
+    <w:lsdException w:name="Table Columns 1" w:semiHidden="1" w:unhideWhenUsed="1"/>
+    <w:lsdException w:name="Table Columns 2" w:semiHidden="1" w:unhideWhenUsed="1"/>
+    <w:lsdException w:name="Table Columns 3" w:semiHidden="1" w:unhideWhenUsed="1"/>
+    <w:lsdException w:name="Table Columns 4" w:semiHidden="1" w:unhideWhenUsed="1"/>
+    <w:lsdException w:name="Table Columns 5" w:semiHidden="1" w:unhideWhenUsed="1"/>
+    <w:lsdException w:name="Table Grid 1" w:semiHidden="1" w:unhideWhenUsed="1"/>
+    <w:lsdException w:name="Table Grid 2" w:semiHidden="1" w:unhideWhenUsed="1"/>
+    <w:lsdException w:name="Table Grid 3" w:semiHidden="1" w:unhideWhenUsed="1"/>
+    <w:lsdException w:name="Table Grid 4" w:semiHidden="1" w:unhideWhenUsed="1"/>
+    <w:lsdException w:name="Table Grid 5" w:semiHidden="1" w:unhideWhenUsed="1"/>
+    <w:lsdException w:name="Table Grid 6" w:semiHidden="1" w:unhideWhenUsed="1"/>
+    <w:lsdException w:name="Table Grid 7" w:semiHidden="1" w:unhideWhenUsed="1"/>
+    <w:lsdException w:name="Table Grid 8" w:semiHidden="1" w:unhideWhenUsed="1"/>
+    <w:lsdException w:name="Table List 1" w:semiHidden="1" w:unhideWhenUsed="1"/>
+    <w:lsdException w:name="Table List 2" w:semiHidden="1" w:unhideWhenUsed="1"/>
+    <w:lsdException w:name="Table List 3" w:semiHidden="1" w:unhideWhenUsed="1"/>
+    <w:lsdException w:name="Table List 4" w:semiHidden="1" w:unhideWhenUsed="1"/>
+    <w:lsdException w:name="Table List 5" w:semiHidden="1" w:unhideWhenUsed="1"/>
+    <w:lsdException w:name="Table List 6" w:semiHidden="1" w:unhideWhenUsed="1"/>
+    <w:lsdException w:name="Table List 7" w:semiHidden="1" w:unhideWhenUsed="1"/>
+    <w:lsdException w:name="Table List 8" w:semiHidden="1" w:unhideWhenUsed="1"/>
+    <w:lsdException w:name="Table 3D effects 1" w:semiHidden="1" w:unhideWhenUsed="1"/>
+    <w:lsdException w:name="Table 3D effects 2" w:semiHidden="1" w:unhideWhenUsed="1"/>
+    <w:lsdException w:name="Table 3D effects 3" w:semiHidden="1" w:unhideWhenUsed="1"/>
+    <w:lsdException w:name="Table Contemporary" w:semiHidden="1" w:unhideWhenUsed="1"/>
+    <w:lsdException w:name="Table Elegant" w:semiHidden="1" w:unhideWhenUsed="1"/>
+    <w:lsdException w:name="Table Professional" w:semiHidden="1" w:unhideWhenUsed="1"/>
+    <w:lsdException w:name="Table Subtle 1" w:semiHidden="1" w:unhideWhenUsed="1"/>
+    <w:lsdException w:name="Table Subtle 2" w:semiHidden="1" w:unhideWhenUsed="1"/>
+    <w:lsdException w:name="Table Web 1" w:semiHidden="1" w:unhideWhenUsed="1"/>
+    <w:lsdException w:name="Table Web 2" w:semiHidden="1" w:unhideWhenUsed="1"/>
+    <w:lsdException w:name="Table Web 3" w:semiHidden="1" w:unhideWhenUsed="1"/>
+    <w:lsdException w:name="Balloon Text" w:semiHidden="1" w:unhideWhenUsed="1"/>
+    <w:lsdException w:name="Table Grid" w:uiPriority="39"/>
+    <w:lsdException w:name="Table Theme" w:semiHidden="1" w:unhideWhenUsed="1"/>
+    <w:lsdException w:name="Placeholder Text" w:semiHidden="1"/>
+    <w:lsdException w:name="No Spacing" w:uiPriority="1" w:qFormat="1"/>
+    <w:lsdException w:name="Light Shading" w:uiPriority="60"/>
+    <w:lsdException w:name="Light List" w:uiPriority="61"/>
+    <w:lsdException w:name="Light Grid" w:uiPriority="62"/>
+    <w:lsdException w:name="Medium Shading 1" w:uiPriority="63"/>
+    <w:lsdException w:name="Medium Shading 2" w:uiPriority="64"/>
+    <w:lsdException w:name="Medium List 1" w:uiPriority="65"/>
+    <w:lsdException w:name="Medium List 2" w:uiPriority="66"/>
+    <w:lsdException w:name="Medium Grid 1" w:uiPriority="67"/>
+    <w:lsdException w:name="Medium Grid 2" w:uiPriority="68"/>
+    <w:lsdException w:name="Medium Grid 3" w:uiPriority="69"/>
+    <w:lsdException w:name="Dark List" w:uiPriority="70"/>
+    <w:lsdException w:name="Colorful Shading" w:uiPriority="71"/>
+    <w:lsdException w:name="Colorful List" w:uiPriority="72"/>
+    <w:lsdException w:name="Colorful Grid" w:uiPriority="73"/>
+    <w:lsdException w:name="Light Shading Accent 1" w:uiPriority="60"/>
+    <w:lsdException w:name="Light List Accent 1" w:uiPriority="61"/>
+    <w:lsdException w:name="Light Grid Accent 1" w:uiPriority="62"/>
+    <w:lsdException w:name="Medium Shading 1 Accent 1" w:uiPriority="63"/>
+    <w:lsdException w:name="Medium Shading 2 Accent 1" w:uiPriority="64"/>
+    <w:lsdException w:name="Medium List 1 Accent 1" w:uiPriority="65"/>
+    <w:lsdException w:name="Revision" w:semiHidden="1"/>
+    <w:lsdException w:name="List Paragraph" w:uiPriority="34" w:qFormat="1"/>
+    <w:lsdException w:name="Quote" w:uiPriority="29" w:qFormat="1"/>
+    <w:lsdException w:name="Intense Quote" w:uiPriority="30" w:qFormat="1"/>
+    <w:lsdException w:name="Medium List 2 Accent 1" w:uiPriority="66"/>
+    <w:lsdException w:name="Medium Grid 1 Accent 1" w:uiPriority="67"/>
+    <w:lsdException w:name="Medium Grid 2 Accent 1" w:uiPriority="68"/>
+    <w:lsdException w:name="Medium Grid 3 Accent 1" w:uiPriority="69"/>
+    <w:lsdException w:name="Dark List Accent 1" w:uiPriority="70"/>
+    <w:lsdException w:name="Colorful Shading Accent 1" w:uiPriority="71"/>
+    <w:lsdException w:name="Colorful List Accent 1" w:uiPriority="72"/>
+    <w:lsdException w:name="Colorful Grid Accent 1" w:uiPriority="73"/>
+    <w:lsdException w:name="Light Shading Accent 2" w:uiPriority="60"/>
+    <w:lsdException w:name="Light List Accent 2" w:uiPriority="61"/>
+    <w:lsdException w:name="Light Grid Accent 2" w:uiPriority="62"/>
+    <w:lsdException w:name="Medium Shading 1 Accent 2" w:uiPriority="63"/>
+    <w:lsdException w:name="Medium Shading 2 Accent 2" w:uiPriority="64"/>
+    <w:lsdException w:name="Medium List 1 Accent 2" w:uiPriority="65"/>
+    <w:lsdException w:name="Medium List 2 Accent 2" w:uiPriority="66"/>
+    <w:lsdException w:name="Medium Grid 1 Accent 2" w:uiPriority="67"/>
+    <w:lsdException w:name="Medium Grid 2 Accent 2" w:uiPriority="68"/>
+    <w:lsdException w:name="Medium Grid 3 Accent 2" w:uiPriority="69"/>
+    <w:lsdException w:name="Dark List Accent 2" w:uiPriority="70"/>
+    <w:lsdException w:name="Colorful Shading Accent 2" w:uiPriority="71"/>
+    <w:lsdException w:name="Colorful List Accent 2" w:uiPriority="72"/>
+    <w:lsdException w:name="Colorful Grid Accent 2" w:uiPriority="73"/>
+    <w:lsdException w:name="Light Shading Accent 3" w:uiPriority="60"/>
+    <w:lsdException w:name="Light List Accent 3" w:uiPriority="61"/>
+    <w:lsdException w:name="Light Grid Accent 3" w:uiPriority="62"/>
+    <w:lsdException w:name="Medium Shading 1 Accent 3" w:uiPriority="63"/>
+    <w:lsdException w:name="Medium Shading 2 Accent 3" w:uiPriority="64"/>
+    <w:lsdException w:name="Medium List 1 Accent 3" w:uiPriority="65"/>
+    <w:lsdException w:name="Medium List 2 Accent 3" w:uiPriority="66"/>
+    <w:lsdException w:name="Medium Grid 1 Accent 3" w:uiPriority="67"/>
+    <w:lsdException w:name="Medium Grid 2 Accent 3" w:uiPriority="68"/>
+    <w:lsdException w:name="Medium Grid 3 Accent 3" w:uiPriority="69"/>
+    <w:lsdException w:name="Dark List Accent 3" w:uiPriority="70"/>
+    <w:lsdException w:name="Colorful Shading Accent 3" w:uiPriority="71"/>
+    <w:lsdException w:name="Colorful List Accent 3" w:uiPriority="72"/>
+    <w:lsdException w:name="Colorful Grid Accent 3" w:uiPriority="73"/>
+    <w:lsdException w:name="Light Shading Accent 4" w:uiPriority="60"/>
+    <w:lsdException w:name="Light List Accent 4" w:uiPriority="61"/>
+    <w:lsdException w:name="Light Grid Accent 4" w:uiPriority="62"/>
+    <w:lsdException w:name="Medium Shading 1 Accent 4" w:uiPriority="63"/>
+    <w:lsdException w:name="Medium Shading 2 Accent 4" w:uiPriority="64"/>
+    <w:lsdException w:name="Medium List 1 Accent 4" w:uiPriority="65"/>
+    <w:lsdException w:name="Medium List 2 Accent 4" w:uiPriority="66"/>
+    <w:lsdException w:name="Medium Grid 1 Accent 4" w:uiPriority="67"/>
+    <w:lsdException w:name="Medium Grid 2 Accent 4" w:uiPriority="68"/>
+    <w:lsdException w:name="Medium Grid 3 Accent 4" w:uiPriority="69"/>
+    <w:lsdException w:name="Dark List Accent 4" w:uiPriority="70"/>
+    <w:lsdException w:name="Colorful Shading Accent 4" w:uiPriority="71"/>
+    <w:lsdException w:name="Colorful List Accent 4" w:uiPriority="72"/>
+    <w:lsdException w:name="Colorful Grid Accent 4" w:uiPriority="73"/>
+    <w:lsdException w:name="Light Shading Accent 5" w:uiPriority="60"/>
+    <w:lsdException w:name="Light List Accent 5" w:uiPriority="61"/>
+    <w:lsdException w:name="Light Grid Accent 5" w:uiPriority="62"/>
+    <w:lsdException w:name="Medium Shading 1 Accent 5" w:uiPriority="63"/>
+    <w:lsdException w:name="Medium Shading 2 Accent 5" w:uiPriority="64"/>
+    <w:lsdException w:name="Medium List 1 Accent 5" w:uiPriority="65"/>
+    <w:lsdException w:name="Medium List 2 Accent 5" w:uiPriority="66"/>
+    <w:lsdException w:name="Medium Grid 1 Accent 5" w:uiPriority="67"/>
+    <w:lsdException w:name="Medium Grid 2 Accent 5" w:uiPriority="68"/>
+    <w:lsdException w:name="Medium Grid 3 Accent 5" w:uiPriority="69"/>
+    <w:lsdException w:name="Dark List Accent 5" w:uiPriority="70"/>
+    <w:lsdException w:name="Colorful Shading Accent 5" w:uiPriority="71"/>
+    <w:lsdException w:name="Colorful List Accent 5" w:uiPriority="72"/>
+    <w:lsdException w:name="Colorful Grid Accent 5" w:uiPriority="73"/>
+    <w:lsdException w:name="Light Shading Accent 6" w:uiPriority="60"/>
+    <w:lsdException w:name="Light List Accent 6" w:uiPriority="61"/>
+    <w:lsdException w:name="Light Grid Accent 6" w:uiPriority="62"/>
+    <w:lsdException w:name="Medium Shading 1 Accent 6" w:uiPriority="63"/>
+    <w:lsdException w:name="Medium Shading 2 Accent 6" w:uiPriority="64"/>
+    <w:lsdException w:name="Medium List 1 Accent 6" w:uiPriority="65"/>
+    <w:lsdException w:name="Medium List 2 Accent 6" w:uiPriority="66"/>
+    <w:lsdException w:name="Medium Grid 1 Accent 6" w:uiPriority="67"/>
+    <w:lsdException w:name="Medium Grid 2 Accent 6" w:uiPriority="68"/>
+    <w:lsdException w:name="Medium Grid 3 Accent 6" w:uiPriority="69"/>
+    <w:lsdException w:name="Dark List Accent 6" w:uiPriority="70"/>
+    <w:lsdException w:name="Colorful Shading Accent 6" w:uiPriority="71"/>
+    <w:lsdException w:name="Colorful List Accent 6" w:uiPriority="72"/>
+    <w:lsdException w:name="Colorful Grid Accent 6" w:uiPriority="73"/>
+    <w:lsdException w:name="Subtle Emphasis" w:uiPriority="19" w:qFormat="1"/>
+    <w:lsdException w:name="Intense Emphasis" w:uiPriority="21" w:qFormat="1"/>
+    <w:lsdException w:name="Subtle Reference" w:uiPriority="31" w:qFormat="1"/>
+    <w:lsdException w:name="Intense Reference" w:uiPriority="32" w:qFormat="1"/>
+    <w:lsdException w:name="Book Title" w:uiPriority="33" w:qFormat="1"/>
+    <w:lsdException w:name="Bibliography" w:semiHidden="1" w:uiPriority="37" w:unhideWhenUsed="1"/>
+    <w:lsdException w:name="TOC Heading" w:semiHidden="1" w:uiPriority="39" w:unhideWhenUsed="1" w:qFormat="1"/>
+    <w:lsdException w:name="Plain Table 1" w:uiPriority="41"/>
+    <w:lsdException w:name="Plain Table 2" w:uiPriority="42"/>
+    <w:lsdException w:name="Plain Table 3" w:uiPriority="43"/>
+    <w:lsdException w:name="Plain Table 4" w:uiPriority="44"/>
+    <w:lsdException w:name="Plain Table 5" w:uiPriority="45"/>
+    <w:lsdException w:name="Grid Table Light" w:uiPriority="40"/>
+    <w:lsdException w:name="Grid Table 1 Light" w:uiPriority="46"/>
+    <w:lsdException w:name="Grid Table 2" w:uiPriority="47"/>
+    <w:lsdException w:name="Grid Table 3" w:uiPriority="48"/>
+    <w:lsdException w:name="Grid Table 4" w:uiPriority="49"/>
+    <w:lsdException w:name="Grid Table 5 Dark" w:uiPriority="50"/>
+    <w:lsdException w:name="Grid Table 6 Colorful" w:uiPriority="51"/>
+    <w:lsdException w:name="Grid Table 7 Colorful" w:uiPriority="52"/>
+    <w:lsdException w:name="Grid Table 1 Light Accent 1" w:uiPriority="46"/>
+    <w:lsdException w:name="Grid Table 2 Accent 1" w:uiPriority="47"/>
+    <w:lsdException w:name="Grid Table 3 Accent 1" w:uiPriority="48"/>
+    <w:lsdException w:name="Grid Table 4 Accent 1" w:uiPriority="49"/>
+    <w:lsdException w:name="Grid Table 5 Dark Accent 1" w:uiPriority="50"/>
+    <w:lsdException w:name="Grid Table 6 Colorful Accent 1" w:uiPriority="51"/>
+    <w:lsdException w:name="Grid Table 7 Colorful Accent 1" w:uiPriority="52"/>
+    <w:lsdException w:name="Grid Table 1 Light Accent 2" w:uiPriority="46"/>
+    <w:lsdException w:name="Grid Table 2 Accent 2" w:uiPriority="47"/>
+    <w:lsdException w:name="Grid Table 3 Accent 2" w:uiPriority="48"/>
+    <w:lsdException w:name="Grid Table 4 Accent 2" w:uiPriority="49"/>
+    <w:lsdException w:name="Grid Table 5 Dark Accent 2" w:uiPriority="50"/>
+    <w:lsdException w:name="Grid Table 6 Colorful Accent 2" w:uiPriority="51"/>
+    <w:lsdException w:name="Grid Table 7 Colorful Accent 2" w:uiPriority="52"/>
+    <w:lsdException w:name="Grid Table 1 Light Accent 3" w:uiPriority="46"/>
+    <w:lsdException w:name="Grid Table 2 Accent 3" w:uiPriority="47"/>
+    <w:lsdException w:name="Grid Table 3 Accent 3" w:uiPriority="48"/>
+    <w:lsdException w:name="Grid Table 4 Accent 3" w:uiPriority="49"/>
+    <w:lsdException w:name="Grid Table 5 Dark Accent 3" w:uiPriority="50"/>
+    <w:lsdException w:name="Grid Table 6 Colorful Accent 3" w:uiPriority="51"/>
+    <w:lsdException w:name="Grid Table 7 Colorful Accent 3" w:uiPriority="52"/>
+    <w:lsdException w:name="Grid Table 1 Light Accent 4" w:uiPriority="46"/>
+    <w:lsdException w:name="Grid Table 2 Accent 4" w:uiPriority="47"/>
+    <w:lsdException w:name="Grid Table 3 Accent 4" w:uiPriority="48"/>
+    <w:lsdException w:name="Grid Table 4 Accent 4" w:uiPriority="49"/>
+    <w:lsdException w:name="Grid Table 5 Dark Accent 4" w:uiPriority="50"/>
+    <w:lsdException w:name="Grid Table 6 Colorful Accent 4" w:uiPriority="51"/>
+    <w:lsdException w:name="Grid Table 7 Colorful Accent 4" w:uiPriority="52"/>
+    <w:lsdException w:name="Grid Table 1 Light Accent 5" w:uiPriority="46"/>
+    <w:lsdException w:name="Grid Table 2 Accent 5" w:uiPriority="47"/>
+    <w:lsdException w:name="Grid Table 3 Accent 5" w:uiPriority="48"/>
+    <w:lsdException w:name="Grid Table 4 Accent 5" w:uiPriority="49"/>
+    <w:lsdException w:name="Grid Table 5 Dark Accent 5" w:uiPriority="50"/>
+    <w:lsdException w:name="Grid Table 6 Colorful Accent 5" w:uiPriority="51"/>
+    <w:lsdException w:name="Grid Table 7 Colorful Accent 5" w:uiPriority="52"/>
+    <w:lsdException w:name="Grid Table 1 Light Accent 6" w:uiPriority="46"/>
+    <w:lsdException w:name="Grid Table 2 Accent 6" w:uiPriority="47"/>
+    <w:lsdException w:name="Grid Table 3 Accent 6" w:uiPriority="48"/>
+    <w:lsdException w:name="Grid Table 4 Accent 6" w:uiPriority="49"/>
+    <w:lsdException w:name="Grid Table 5 Dark Accent 6" w:uiPriority="50"/>
+    <w:lsdException w:name="Grid Table 6 Colorful Accent 6" w:uiPriority="51"/>
+    <w:lsdException w:name="Grid Table 7 Colorful Accent 6" w:uiPriority="52"/>
+    <w:lsdException w:name="List Table 1 Light" w:uiPriority="46"/>
+    <w:lsdException w:name="List Table 2" w:uiPriority="47"/>
+    <w:lsdException w:name="List Table 3" w:uiPriority="48"/>
+    <w:lsdException w:name="List Table 4" w:uiPriority="49"/>
+    <w:lsdException w:name="List Table 5 Dark" w:uiPriority="50"/>
+    <w:lsdException w:name="List Table 6 Colorful" w:uiPriority="51"/>
+    <w:lsdException w:name="List Table 7 Colorful" w:uiPriority="52"/>
+    <w:lsdException w:name="List Table 1 Light Accent 1" w:uiPriority="46"/>
+    <w:lsdException w:name="List Table 2 Accent 1" w:uiPriority="47"/>
+    <w:lsdException w:name="List Table 3 Accent 1" w:uiPriority="48"/>
+    <w:lsdException w:name="List Table 4 Accent 1" w:uiPriority="49"/>
+    <w:lsdException w:name="List Table 5 Dark Accent 1" w:uiPriority="50"/>
+    <w:lsdException w:name="List Table 6 Colorful Accent 1" w:uiPriority="51"/>
+    <w:lsdException w:name="List Table 7 Colorful Accent 1" w:uiPriority="52"/>
+    <w:lsdException w:name="List Table 1 Light Accent 2" w:uiPriority="46"/>
+    <w:lsdException w:name="List Table 2 Accent 2" w:uiPriority="47"/>
+    <w:lsdException w:name="List Table 3 Accent 2" w:uiPriority="48"/>
+    <w:lsdException w:name="List Table 4 Accent 2" w:uiPriority="49"/>
+    <w:lsdException w:name="List Table 5 Dark Accent 2" w:uiPriority="50"/>
+    <w:lsdException w:name="List Table 6 Colorful Accent 2" w:uiPriority="51"/>
+    <w:lsdException w:name="List Table 7 Colorful Accent 2" w:uiPriority="52"/>
+    <w:lsdException w:name="List Table 1 Light Accent 3" w:uiPriority="46"/>
+    <w:lsdException w:name="List Table 2 Accent 3" w:uiPriority="47"/>
+    <w:lsdException w:name="List Table 3 Accent 3" w:uiPriority="48"/>
+    <w:lsdException w:name="List Table 4 Accent 3" w:uiPriority="49"/>
+    <w:lsdException w:name="List Table 5 Dark Accent 3" w:uiPriority="50"/>
+    <w:lsdException w:name="List Table 6 Colorful Accent 3" w:uiPriority="51"/>
+    <w:lsdException w:name="List Table 7 Colorful Accent 3" w:uiPriority="52"/>
+    <w:lsdException w:name="List Table 1 Light Accent 4" w:uiPriority="46"/>
+    <w:lsdException w:name="List Table 2 Accent 4" w:uiPriority="47"/>
+    <w:lsdException w:name="List Table 3 Accent 4" w:uiPriority="48"/>
+    <w:lsdException w:name="List Table 4 Accent 4" w:uiPriority="49"/>
+    <w:lsdException w:name="List Table 5 Dark Accent 4" w:uiPriority="50"/>
+    <w:lsdException w:name="List Table 6 Colorful Accent 4" w:uiPriority="51"/>
+    <w:lsdException w:name="List Table 7 Colorful Accent 4" w:uiPriority="52"/>
+    <w:lsdException w:name="List Table 1 Light Accent 5" w:uiPriority="46"/>
+    <w:lsdException w:name="List Table 2 Accent 5" w:uiPriority="47"/>
+    <w:lsdException w:name="List Table 3 Accent 5" w:uiPriority="48"/>
+    <w:lsdException w:name="List Table 4 Accent 5" w:uiPriority="49"/>
+    <w:lsdException w:name="List Table 5 Dark Accent 5" w:uiPriority="50"/>
+    <w:lsdException w:name="List Table 6 Colorful Accent 5" w:uiPriority="51"/>
+    <w:lsdException w:name="List Table 7 Colorful Accent 5" w:uiPriority="52"/>
+    <w:lsdException w:name="List Table 1 Light Accent 6" w:uiPriority="46"/>
+    <w:lsdException w:name="List Table 2 Accent 6" w:uiPriority="47"/>
+    <w:lsdException w:name="List Table 3 Accent 6" w:uiPriority="48"/>
+    <w:lsdException w:name="List Table 4 Accent 6" w:uiPriority="49"/>
+    <w:lsdException w:name="List Table 5 Dark Accent 6" w:uiPriority="50"/>
+    <w:lsdException w:name="List Table 6 Colorful Accent 6" w:uiPriority="51"/>
+    <w:lsdException w:name="List Table 7 Colorful Accent 6" w:uiPriority="52"/>
+    <w:lsdException w:name="Mention" w:semiHidden="1" w:unhideWhenUsed="1"/>
+    <w:lsdException w:name="Smart Hyperlink" w:semiHidden="1" w:unhideWhenUsed="1"/>
+    <w:lsdException w:name="Hashtag" w:semiHidden="1" w:unhideWhenUsed="1"/>
+    <w:lsdException w:name="Unresolved Mention" w:semiHidden="1" w:unhideWhenUsed="1"/>
+    <w:lsdException w:name="Smart Link" w:semiHidden="1" w:unhideWhenUsed="1"/>
   </w:latentStyles>
   <w:style w:type="paragraph" w:default="1" w:styleId="Normal">
     <w:name w:val="Normal"/>
     <w:qFormat/>
   </w:style>
-  <w:style w:type="character" w:default="1" w:styleId="Fuentedeprrafopredeter">
+  <w:style w:type="character" w:default="1" w:styleId="DefaultParagraphFont">
     <w:name w:val="Default Paragraph Font"/>
     <w:uiPriority w:val="1"/>
     <w:semiHidden/>
     <w:unhideWhenUsed/>
   </w:style>
-  <w:style w:type="table" w:default="1" w:styleId="Tablanormal">
+  <w:style w:type="table" w:default="1" w:styleId="TableNormal">
     <w:name w:val="Normal Table"/>
     <w:uiPriority w:val="99"/>
     <w:semiHidden/>
@@ -2420,16 +4459,16 @@
       </w:tblCellMar>
     </w:tblPr>
   </w:style>
-  <w:style w:type="numbering" w:default="1" w:styleId="Sinlista">
+  <w:style w:type="numbering" w:default="1" w:styleId="NoList">
     <w:name w:val="No List"/>
     <w:uiPriority w:val="99"/>
     <w:semiHidden/>
     <w:unhideWhenUsed/>
   </w:style>
-  <w:style w:type="paragraph" w:styleId="Textodeglobo">
+  <w:style w:type="paragraph" w:styleId="BalloonText">
     <w:name w:val="Balloon Text"/>
     <w:basedOn w:val="Normal"/>
-    <w:link w:val="TextodegloboCar"/>
+    <w:link w:val="BalloonTextChar"/>
     <w:uiPriority w:val="99"/>
     <w:semiHidden/>
     <w:unhideWhenUsed/>
@@ -2443,10 +4482,10 @@
       <w:szCs w:val="16"/>
     </w:rPr>
   </w:style>
-  <w:style w:type="character" w:customStyle="1" w:styleId="TextodegloboCar">
-    <w:name w:val="Texto de globo Car"/>
-    <w:basedOn w:val="Fuentedeprrafopredeter"/>
-    <w:link w:val="Textodeglobo"/>
+  <w:style w:type="character" w:customStyle="1" w:styleId="BalloonTextChar">
+    <w:name w:val="Balloon Text Char"/>
+    <w:basedOn w:val="DefaultParagraphFont"/>
+    <w:link w:val="BalloonText"/>
     <w:uiPriority w:val="99"/>
     <w:semiHidden/>
     <w:rsid w:val="003C0BAF"/>
@@ -2456,225 +4495,15 @@
       <w:szCs w:val="16"/>
     </w:rPr>
   </w:style>
-</w:styles>
-</file>
-
-<file path=word/stylesWithEffects.xml><?xml version="1.0" encoding="utf-8"?>
-<w:styles xmlns:wpc="http://schemas.microsoft.com/office/word/2010/wordprocessingCanvas" xmlns:mc="http://schemas.openxmlformats.org/markup-compatibility/2006" xmlns:o="urn:schemas-microsoft-com:office:office" xmlns:r="http://schemas.openxmlformats.org/officeDocument/2006/relationships" xmlns:m="http://schemas.openxmlformats.org/officeDocument/2006/math" xmlns:v="urn:schemas-microsoft-com:vml" xmlns:wp14="http://schemas.microsoft.com/office/word/2010/wordprocessingDrawing" xmlns:wp="http://schemas.openxmlformats.org/drawingml/2006/wordprocessingDrawing" xmlns:w10="urn:schemas-microsoft-com:office:word" xmlns:w="http://schemas.openxmlformats.org/wordprocessingml/2006/main" xmlns:w14="http://schemas.microsoft.com/office/word/2010/wordml" xmlns:wpg="http://schemas.microsoft.com/office/word/2010/wordprocessingGroup" xmlns:wpi="http://schemas.microsoft.com/office/word/2010/wordprocessingInk" xmlns:wne="http://schemas.microsoft.com/office/word/2006/wordml" xmlns:wps="http://schemas.microsoft.com/office/word/2010/wordprocessingShape" mc:Ignorable="w14 wp14">
-  <w:docDefaults>
-    <w:rPrDefault>
-      <w:rPr>
-        <w:rFonts w:asciiTheme="minorHAnsi" w:eastAsiaTheme="minorHAnsi" w:hAnsiTheme="minorHAnsi" w:cstheme="minorBidi"/>
-        <w:sz w:val="22"/>
-        <w:szCs w:val="22"/>
-        <w:lang w:val="es-AR" w:eastAsia="en-US" w:bidi="ar-SA"/>
-      </w:rPr>
-    </w:rPrDefault>
-    <w:pPrDefault>
-      <w:pPr>
-        <w:spacing w:after="160" w:line="259" w:lineRule="auto"/>
-      </w:pPr>
-    </w:pPrDefault>
-  </w:docDefaults>
-  <w:latentStyles w:defLockedState="0" w:defUIPriority="99" w:defSemiHidden="1" w:defUnhideWhenUsed="1" w:defQFormat="0" w:count="267">
-    <w:lsdException w:name="Normal" w:semiHidden="0" w:uiPriority="0" w:unhideWhenUsed="0" w:qFormat="1"/>
-    <w:lsdException w:name="heading 1" w:semiHidden="0" w:uiPriority="9" w:unhideWhenUsed="0" w:qFormat="1"/>
-    <w:lsdException w:name="heading 2" w:uiPriority="9" w:qFormat="1"/>
-    <w:lsdException w:name="heading 3" w:uiPriority="9" w:qFormat="1"/>
-    <w:lsdException w:name="heading 4" w:uiPriority="9" w:qFormat="1"/>
-    <w:lsdException w:name="heading 5" w:uiPriority="9" w:qFormat="1"/>
-    <w:lsdException w:name="heading 6" w:uiPriority="9" w:qFormat="1"/>
-    <w:lsdException w:name="heading 7" w:uiPriority="9" w:qFormat="1"/>
-    <w:lsdException w:name="heading 8" w:uiPriority="9" w:qFormat="1"/>
-    <w:lsdException w:name="heading 9" w:uiPriority="9" w:qFormat="1"/>
-    <w:lsdException w:name="toc 1" w:uiPriority="39"/>
-    <w:lsdException w:name="toc 2" w:uiPriority="39"/>
-    <w:lsdException w:name="toc 3" w:uiPriority="39"/>
-    <w:lsdException w:name="toc 4" w:uiPriority="39"/>
-    <w:lsdException w:name="toc 5" w:uiPriority="39"/>
-    <w:lsdException w:name="toc 6" w:uiPriority="39"/>
-    <w:lsdException w:name="toc 7" w:uiPriority="39"/>
-    <w:lsdException w:name="toc 8" w:uiPriority="39"/>
-    <w:lsdException w:name="toc 9" w:uiPriority="39"/>
-    <w:lsdException w:name="caption" w:uiPriority="35" w:qFormat="1"/>
-    <w:lsdException w:name="Title" w:semiHidden="0" w:uiPriority="10" w:unhideWhenUsed="0" w:qFormat="1"/>
-    <w:lsdException w:name="Default Paragraph Font" w:uiPriority="1"/>
-    <w:lsdException w:name="Subtitle" w:semiHidden="0" w:uiPriority="11" w:unhideWhenUsed="0" w:qFormat="1"/>
-    <w:lsdException w:name="Strong" w:semiHidden="0" w:uiPriority="22" w:unhideWhenUsed="0" w:qFormat="1"/>
-    <w:lsdException w:name="Emphasis" w:semiHidden="0" w:uiPriority="20" w:unhideWhenUsed="0" w:qFormat="1"/>
-    <w:lsdException w:name="Table Grid" w:semiHidden="0" w:uiPriority="39" w:unhideWhenUsed="0"/>
-    <w:lsdException w:name="Placeholder Text" w:unhideWhenUsed="0"/>
-    <w:lsdException w:name="No Spacing" w:semiHidden="0" w:uiPriority="1" w:unhideWhenUsed="0" w:qFormat="1"/>
-    <w:lsdException w:name="Light Shading" w:semiHidden="0" w:uiPriority="60" w:unhideWhenUsed="0"/>
-    <w:lsdException w:name="Light List" w:semiHidden="0" w:uiPriority="61" w:unhideWhenUsed="0"/>
-    <w:lsdException w:name="Light Grid" w:semiHidden="0" w:uiPriority="62" w:unhideWhenUsed="0"/>
-    <w:lsdException w:name="Medium Shading 1" w:semiHidden="0" w:uiPriority="63" w:unhideWhenUsed="0"/>
-    <w:lsdException w:name="Medium Shading 2" w:semiHidden="0" w:uiPriority="64" w:unhideWhenUsed="0"/>
-    <w:lsdException w:name="Medium List 1" w:semiHidden="0" w:uiPriority="65" w:unhideWhenUsed="0"/>
-    <w:lsdException w:name="Medium List 2" w:semiHidden="0" w:uiPriority="66" w:unhideWhenUsed="0"/>
-    <w:lsdException w:name="Medium Grid 1" w:semiHidden="0" w:uiPriority="67" w:unhideWhenUsed="0"/>
-    <w:lsdException w:name="Medium Grid 2" w:semiHidden="0" w:uiPriority="68" w:unhideWhenUsed="0"/>
-    <w:lsdException w:name="Medium Grid 3" w:semiHidden="0" w:uiPriority="69" w:unhideWhenUsed="0"/>
-    <w:lsdException w:name="Dark List" w:semiHidden="0" w:uiPriority="70" w:unhideWhenUsed="0"/>
-    <w:lsdException w:name="Colorful Shading" w:semiHidden="0" w:uiPriority="71" w:unhideWhenUsed="0"/>
-    <w:lsdException w:name="Colorful List" w:semiHidden="0" w:uiPriority="72" w:unhideWhenUsed="0"/>
-    <w:lsdException w:name="Colorful Grid" w:semiHidden="0" w:uiPriority="73" w:unhideWhenUsed="0"/>
-    <w:lsdException w:name="Light Shading Accent 1" w:semiHidden="0" w:uiPriority="60" w:unhideWhenUsed="0"/>
-    <w:lsdException w:name="Light List Accent 1" w:semiHidden="0" w:uiPriority="61" w:unhideWhenUsed="0"/>
-    <w:lsdException w:name="Light Grid Accent 1" w:semiHidden="0" w:uiPriority="62" w:unhideWhenUsed="0"/>
-    <w:lsdException w:name="Medium Shading 1 Accent 1" w:semiHidden="0" w:uiPriority="63" w:unhideWhenUsed="0"/>
-    <w:lsdException w:name="Medium Shading 2 Accent 1" w:semiHidden="0" w:uiPriority="64" w:unhideWhenUsed="0"/>
-    <w:lsdException w:name="Medium List 1 Accent 1" w:semiHidden="0" w:uiPriority="65" w:unhideWhenUsed="0"/>
-    <w:lsdException w:name="Revision" w:unhideWhenUsed="0"/>
-    <w:lsdException w:name="List Paragraph" w:semiHidden="0" w:uiPriority="34" w:unhideWhenUsed="0" w:qFormat="1"/>
-    <w:lsdException w:name="Quote" w:semiHidden="0" w:uiPriority="29" w:unhideWhenUsed="0" w:qFormat="1"/>
-    <w:lsdException w:name="Intense Quote" w:semiHidden="0" w:uiPriority="30" w:unhideWhenUsed="0" w:qFormat="1"/>
-    <w:lsdException w:name="Medium List 2 Accent 1" w:semiHidden="0" w:uiPriority="66" w:unhideWhenUsed="0"/>
-    <w:lsdException w:name="Medium Grid 1 Accent 1" w:semiHidden="0" w:uiPriority="67" w:unhideWhenUsed="0"/>
-    <w:lsdException w:name="Medium Grid 2 Accent 1" w:semiHidden="0" w:uiPriority="68" w:unhideWhenUsed="0"/>
-    <w:lsdException w:name="Medium Grid 3 Accent 1" w:semiHidden="0" w:uiPriority="69" w:unhideWhenUsed="0"/>
-    <w:lsdException w:name="Dark List Accent 1" w:semiHidden="0" w:uiPriority="70" w:unhideWhenUsed="0"/>
-    <w:lsdException w:name="Colorful Shading Accent 1" w:semiHidden="0" w:uiPriority="71" w:unhideWhenUsed="0"/>
-    <w:lsdException w:name="Colorful List Accent 1" w:semiHidden="0" w:uiPriority="72" w:unhideWhenUsed="0"/>
-    <w:lsdException w:name="Colorful Grid Accent 1" w:semiHidden="0" w:uiPriority="73" w:unhideWhenUsed="0"/>
-    <w:lsdException w:name="Light Shading Accent 2" w:semiHidden="0" w:uiPriority="60" w:unhideWhenUsed="0"/>
-    <w:lsdException w:name="Light List Accent 2" w:semiHidden="0" w:uiPriority="61" w:unhideWhenUsed="0"/>
-    <w:lsdException w:name="Light Grid Accent 2" w:semiHidden="0" w:uiPriority="62" w:unhideWhenUsed="0"/>
-    <w:lsdException w:name="Medium Shading 1 Accent 2" w:semiHidden="0" w:uiPriority="63" w:unhideWhenUsed="0"/>
-    <w:lsdException w:name="Medium Shading 2 Accent 2" w:semiHidden="0" w:uiPriority="64" w:unhideWhenUsed="0"/>
-    <w:lsdException w:name="Medium List 1 Accent 2" w:semiHidden="0" w:uiPriority="65" w:unhideWhenUsed="0"/>
-    <w:lsdException w:name="Medium List 2 Accent 2" w:semiHidden="0" w:uiPriority="66" w:unhideWhenUsed="0"/>
-    <w:lsdException w:name="Medium Grid 1 Accent 2" w:semiHidden="0" w:uiPriority="67" w:unhideWhenUsed="0"/>
-    <w:lsdException w:name="Medium Grid 2 Accent 2" w:semiHidden="0" w:uiPriority="68" w:unhideWhenUsed="0"/>
-    <w:lsdException w:name="Medium Grid 3 Accent 2" w:semiHidden="0" w:uiPriority="69" w:unhideWhenUsed="0"/>
-    <w:lsdException w:name="Dark List Accent 2" w:semiHidden="0" w:uiPriority="70" w:unhideWhenUsed="0"/>
-    <w:lsdException w:name="Colorful Shading Accent 2" w:semiHidden="0" w:uiPriority="71" w:unhideWhenUsed="0"/>
-    <w:lsdException w:name="Colorful List Accent 2" w:semiHidden="0" w:uiPriority="72" w:unhideWhenUsed="0"/>
-    <w:lsdException w:name="Colorful Grid Accent 2" w:semiHidden="0" w:uiPriority="73" w:unhideWhenUsed="0"/>
-    <w:lsdException w:name="Light Shading Accent 3" w:semiHidden="0" w:uiPriority="60" w:unhideWhenUsed="0"/>
-    <w:lsdException w:name="Light List Accent 3" w:semiHidden="0" w:uiPriority="61" w:unhideWhenUsed="0"/>
-    <w:lsdException w:name="Light Grid Accent 3" w:semiHidden="0" w:uiPriority="62" w:unhideWhenUsed="0"/>
-    <w:lsdException w:name="Medium Shading 1 Accent 3" w:semiHidden="0" w:uiPriority="63" w:unhideWhenUsed="0"/>
-    <w:lsdException w:name="Medium Shading 2 Accent 3" w:semiHidden="0" w:uiPriority="64" w:unhideWhenUsed="0"/>
-    <w:lsdException w:name="Medium List 1 Accent 3" w:semiHidden="0" w:uiPriority="65" w:unhideWhenUsed="0"/>
-    <w:lsdException w:name="Medium List 2 Accent 3" w:semiHidden="0" w:uiPriority="66" w:unhideWhenUsed="0"/>
-    <w:lsdException w:name="Medium Grid 1 Accent 3" w:semiHidden="0" w:uiPriority="67" w:unhideWhenUsed="0"/>
-    <w:lsdException w:name="Medium Grid 2 Accent 3" w:semiHidden="0" w:uiPriority="68" w:unhideWhenUsed="0"/>
-    <w:lsdException w:name="Medium Grid 3 Accent 3" w:semiHidden="0" w:uiPriority="69" w:unhideWhenUsed="0"/>
-    <w:lsdException w:name="Dark List Accent 3" w:semiHidden="0" w:uiPriority="70" w:unhideWhenUsed="0"/>
-    <w:lsdException w:name="Colorful Shading Accent 3" w:semiHidden="0" w:uiPriority="71" w:unhideWhenUsed="0"/>
-    <w:lsdException w:name="Colorful List Accent 3" w:semiHidden="0" w:uiPriority="72" w:unhideWhenUsed="0"/>
-    <w:lsdException w:name="Colorful Grid Accent 3" w:semiHidden="0" w:uiPriority="73" w:unhideWhenUsed="0"/>
-    <w:lsdException w:name="Light Shading Accent 4" w:semiHidden="0" w:uiPriority="60" w:unhideWhenUsed="0"/>
-    <w:lsdException w:name="Light List Accent 4" w:semiHidden="0" w:uiPriority="61" w:unhideWhenUsed="0"/>
-    <w:lsdException w:name="Light Grid Accent 4" w:semiHidden="0" w:uiPriority="62" w:unhideWhenUsed="0"/>
-    <w:lsdException w:name="Medium Shading 1 Accent 4" w:semiHidden="0" w:uiPriority="63" w:unhideWhenUsed="0"/>
-    <w:lsdException w:name="Medium Shading 2 Accent 4" w:semiHidden="0" w:uiPriority="64" w:unhideWhenUsed="0"/>
-    <w:lsdException w:name="Medium List 1 Accent 4" w:semiHidden="0" w:uiPriority="65" w:unhideWhenUsed="0"/>
-    <w:lsdException w:name="Medium List 2 Accent 4" w:semiHidden="0" w:uiPriority="66" w:unhideWhenUsed="0"/>
-    <w:lsdException w:name="Medium Grid 1 Accent 4" w:semiHidden="0" w:uiPriority="67" w:unhideWhenUsed="0"/>
-    <w:lsdException w:name="Medium Grid 2 Accent 4" w:semiHidden="0" w:uiPriority="68" w:unhideWhenUsed="0"/>
-    <w:lsdException w:name="Medium Grid 3 Accent 4" w:semiHidden="0" w:uiPriority="69" w:unhideWhenUsed="0"/>
-    <w:lsdException w:name="Dark List Accent 4" w:semiHidden="0" w:uiPriority="70" w:unhideWhenUsed="0"/>
-    <w:lsdException w:name="Colorful Shading Accent 4" w:semiHidden="0" w:uiPriority="71" w:unhideWhenUsed="0"/>
-    <w:lsdException w:name="Colorful List Accent 4" w:semiHidden="0" w:uiPriority="72" w:unhideWhenUsed="0"/>
-    <w:lsdException w:name="Colorful Grid Accent 4" w:semiHidden="0" w:uiPriority="73" w:unhideWhenUsed="0"/>
-    <w:lsdException w:name="Light Shading Accent 5" w:semiHidden="0" w:uiPriority="60" w:unhideWhenUsed="0"/>
-    <w:lsdException w:name="Light List Accent 5" w:semiHidden="0" w:uiPriority="61" w:unhideWhenUsed="0"/>
-    <w:lsdException w:name="Light Grid Accent 5" w:semiHidden="0" w:uiPriority="62" w:unhideWhenUsed="0"/>
-    <w:lsdException w:name="Medium Shading 1 Accent 5" w:semiHidden="0" w:uiPriority="63" w:unhideWhenUsed="0"/>
-    <w:lsdException w:name="Medium Shading 2 Accent 5" w:semiHidden="0" w:uiPriority="64" w:unhideWhenUsed="0"/>
-    <w:lsdException w:name="Medium List 1 Accent 5" w:semiHidden="0" w:uiPriority="65" w:unhideWhenUsed="0"/>
-    <w:lsdException w:name="Medium List 2 Accent 5" w:semiHidden="0" w:uiPriority="66" w:unhideWhenUsed="0"/>
-    <w:lsdException w:name="Medium Grid 1 Accent 5" w:semiHidden="0" w:uiPriority="67" w:unhideWhenUsed="0"/>
-    <w:lsdException w:name="Medium Grid 2 Accent 5" w:semiHidden="0" w:uiPriority="68" w:unhideWhenUsed="0"/>
-    <w:lsdException w:name="Medium Grid 3 Accent 5" w:semiHidden="0" w:uiPriority="69" w:unhideWhenUsed="0"/>
-    <w:lsdException w:name="Dark List Accent 5" w:semiHidden="0" w:uiPriority="70" w:unhideWhenUsed="0"/>
-    <w:lsdException w:name="Colorful Shading Accent 5" w:semiHidden="0" w:uiPriority="71" w:unhideWhenUsed="0"/>
-    <w:lsdException w:name="Colorful List Accent 5" w:semiHidden="0" w:uiPriority="72" w:unhideWhenUsed="0"/>
-    <w:lsdException w:name="Colorful Grid Accent 5" w:semiHidden="0" w:uiPriority="73" w:unhideWhenUsed="0"/>
-    <w:lsdException w:name="Light Shading Accent 6" w:semiHidden="0" w:uiPriority="60" w:unhideWhenUsed="0"/>
-    <w:lsdException w:name="Light List Accent 6" w:semiHidden="0" w:uiPriority="61" w:unhideWhenUsed="0"/>
-    <w:lsdException w:name="Light Grid Accent 6" w:semiHidden="0" w:uiPriority="62" w:unhideWhenUsed="0"/>
-    <w:lsdException w:name="Medium Shading 1 Accent 6" w:semiHidden="0" w:uiPriority="63" w:unhideWhenUsed="0"/>
-    <w:lsdException w:name="Medium Shading 2 Accent 6" w:semiHidden="0" w:uiPriority="64" w:unhideWhenUsed="0"/>
-    <w:lsdException w:name="Medium List 1 Accent 6" w:semiHidden="0" w:uiPriority="65" w:unhideWhenUsed="0"/>
-    <w:lsdException w:name="Medium List 2 Accent 6" w:semiHidden="0" w:uiPriority="66" w:unhideWhenUsed="0"/>
-    <w:lsdException w:name="Medium Grid 1 Accent 6" w:semiHidden="0" w:uiPriority="67" w:unhideWhenUsed="0"/>
-    <w:lsdException w:name="Medium Grid 2 Accent 6" w:semiHidden="0" w:uiPriority="68" w:unhideWhenUsed="0"/>
-    <w:lsdException w:name="Medium Grid 3 Accent 6" w:semiHidden="0" w:uiPriority="69" w:unhideWhenUsed="0"/>
-    <w:lsdException w:name="Dark List Accent 6" w:semiHidden="0" w:uiPriority="70" w:unhideWhenUsed="0"/>
-    <w:lsdException w:name="Colorful Shading Accent 6" w:semiHidden="0" w:uiPriority="71" w:unhideWhenUsed="0"/>
-    <w:lsdException w:name="Colorful List Accent 6" w:semiHidden="0" w:uiPriority="72" w:unhideWhenUsed="0"/>
-    <w:lsdException w:name="Colorful Grid Accent 6" w:semiHidden="0" w:uiPriority="73" w:unhideWhenUsed="0"/>
-    <w:lsdException w:name="Subtle Emphasis" w:semiHidden="0" w:uiPriority="19" w:unhideWhenUsed="0" w:qFormat="1"/>
-    <w:lsdException w:name="Intense Emphasis" w:semiHidden="0" w:uiPriority="21" w:unhideWhenUsed="0" w:qFormat="1"/>
-    <w:lsdException w:name="Subtle Reference" w:semiHidden="0" w:uiPriority="31" w:unhideWhenUsed="0" w:qFormat="1"/>
-    <w:lsdException w:name="Intense Reference" w:semiHidden="0" w:uiPriority="32" w:unhideWhenUsed="0" w:qFormat="1"/>
-    <w:lsdException w:name="Book Title" w:semiHidden="0" w:uiPriority="33" w:unhideWhenUsed="0" w:qFormat="1"/>
-    <w:lsdException w:name="Bibliography" w:uiPriority="37"/>
-    <w:lsdException w:name="TOC Heading" w:uiPriority="39" w:qFormat="1"/>
-  </w:latentStyles>
-  <w:style w:type="paragraph" w:default="1" w:styleId="Normal">
-    <w:name w:val="Normal"/>
-    <w:qFormat/>
-  </w:style>
-  <w:style w:type="character" w:default="1" w:styleId="Fuentedeprrafopredeter">
-    <w:name w:val="Default Paragraph Font"/>
-    <w:uiPriority w:val="1"/>
-    <w:semiHidden/>
-    <w:unhideWhenUsed/>
-  </w:style>
-  <w:style w:type="table" w:default="1" w:styleId="Tablanormal">
-    <w:name w:val="Normal Table"/>
+  <w:style w:type="paragraph" w:styleId="Revision">
+    <w:name w:val="Revision"/>
+    <w:hidden/>
     <w:uiPriority w:val="99"/>
     <w:semiHidden/>
-    <w:unhideWhenUsed/>
-    <w:tblPr>
-      <w:tblInd w:w="0" w:type="dxa"/>
-      <w:tblCellMar>
-        <w:top w:w="0" w:type="dxa"/>
-        <w:left w:w="108" w:type="dxa"/>
-        <w:bottom w:w="0" w:type="dxa"/>
-        <w:right w:w="108" w:type="dxa"/>
-      </w:tblCellMar>
-    </w:tblPr>
-  </w:style>
-  <w:style w:type="numbering" w:default="1" w:styleId="Sinlista">
-    <w:name w:val="No List"/>
-    <w:uiPriority w:val="99"/>
-    <w:semiHidden/>
-    <w:unhideWhenUsed/>
-  </w:style>
-  <w:style w:type="paragraph" w:styleId="Textodeglobo">
-    <w:name w:val="Balloon Text"/>
-    <w:basedOn w:val="Normal"/>
-    <w:link w:val="TextodegloboCar"/>
-    <w:uiPriority w:val="99"/>
-    <w:semiHidden/>
-    <w:unhideWhenUsed/>
-    <w:rsid w:val="003C0BAF"/>
+    <w:rsid w:val="00EB615C"/>
     <w:pPr>
       <w:spacing w:after="0" w:line="240" w:lineRule="auto"/>
     </w:pPr>
-    <w:rPr>
-      <w:rFonts w:ascii="Tahoma" w:hAnsi="Tahoma" w:cs="Tahoma"/>
-      <w:sz w:val="16"/>
-      <w:szCs w:val="16"/>
-    </w:rPr>
-  </w:style>
-  <w:style w:type="character" w:customStyle="1" w:styleId="TextodegloboCar">
-    <w:name w:val="Texto de globo Car"/>
-    <w:basedOn w:val="Fuentedeprrafopredeter"/>
-    <w:link w:val="Textodeglobo"/>
-    <w:uiPriority w:val="99"/>
-    <w:semiHidden/>
-    <w:rsid w:val="003C0BAF"/>
-    <w:rPr>
-      <w:rFonts w:ascii="Tahoma" w:hAnsi="Tahoma" w:cs="Tahoma"/>
-      <w:sz w:val="16"/>
-      <w:szCs w:val="16"/>
-    </w:rPr>
   </w:style>
 </w:styles>
 </file>
@@ -2968,7 +4797,7 @@
   <a:extraClrSchemeLst/>
   <a:extLst>
     <a:ext uri="{05A4C25C-085E-4340-85A3-A5531E510DB2}">
-      <thm15:themeFamily xmlns="" xmlns:thm15="http://schemas.microsoft.com/office/thememl/2012/main" name="Office Theme" id="{62F939B6-93AF-4DB8-9C6B-D6C7DFDC589F}" vid="{4A3C46E8-61CC-4603-A589-7422A47A8E4A}"/>
+      <thm15:themeFamily xmlns:thm15="http://schemas.microsoft.com/office/thememl/2012/main" name="Office Theme" id="{62F939B6-93AF-4DB8-9C6B-D6C7DFDC589F}" vid="{4A3C46E8-61CC-4603-A589-7422A47A8E4A}"/>
     </a:ext>
   </a:extLst>
 </a:theme>

</xml_diff>